<commit_message>
Preserve first-pass R2 R3 revision
</commit_message>
<xml_diff>
--- a/Response_to_Reviewers.docx
+++ b/Response_to_Reviewers.docx
@@ -4,628 +4,409 @@
   <w:body>
     <w:p>
       <w:pPr>
-        <w:spacing w:before="0"/>
+        <w:pStyle w:val="Heading1"/>
       </w:pPr>
       <w:r>
-        <w:rPr>
-          <w:b/>
-          <w:color w:val="1F3B73"/>
-          <w:sz w:val="32"/>
-        </w:rPr>
-        <w:t>Response to the Reviewers</w:t>
+        <w:t>Response to Reviewers</w:t>
       </w:r>
     </w:p>
     <w:p>
       <w:r>
-        <w:rPr>
-          <w:i/>
-        </w:rPr>
-        <w:t xml:space="preserve">Manuscript foods-4411772 — </w:t>
-      </w:r>
-      <w:r>
-        <w:rPr>
-          <w:i/>
-        </w:rPr>
-        <w:t>“Effect of Palletisation and Temperature on Bag-in-Box Wine Packaging under Simulated Export Conditions”</w:t>
+        <w:t>Manuscript: "Palletisation and In-Bag Thermal Exposure in Bag-in-Box Wine Packaging under Simulated Export Conditions"</w:t>
       </w:r>
     </w:p>
     <w:p>
       <w:r>
-        <w:t>We thank the three reviewers for the care they devoted to the manuscript. The comments were detailed and, in several cases, they pointed to problems that we had not seen ourselves. One of them — the discrepancy between the 20-day storage period and the axis of Figure 3 — led us back to the raw logger files and revealed a plotting error that had propagated into the interpretation of the physical data. Correcting it changed part of our conclusions, and we are grateful that the point was raised before publication. All modifications are highlighted in the revised manuscript. The changes proposed by the co-authors are marked in green and the remaining revisions in yellow. Line numbers refer to the revised file.</w:t>
-      </w:r>
-    </w:p>
-    <w:p>
-      <w:r>
-        <w:t>One point of substance should be flagged at the outset, since it bears on several answers below. Plotting the full record (see Reviewer 1, third point) revealed that the chamber set to 50 °C had not delivered that condition: under a full pallet the wine reached only 33.6 ± 1.5 °C in the units at the top of the stacks and 25.5 ± 0.9 °C in those at the bottom, with a persistent vertical gradient of about 8 °C, while the 19 °C chamber held its set point normally. The shortfall was later attributed to the air circulation of the enclosure; what the verification trial establishes with certainty is that it lay in the chamber and not in the packaging or the instruments, since the same bags, cardboard and sensors reached the set point once a working chamber was used. Rather than describe an exposure that did not take place, we have reported the temperatures actually recorded, added them to Figure 3 beside the pressure, and — most importantly — carried out a dedicated verification trial at a confirmed 50 °C, which is reported in a new Section 3.3 with two new figures (Figure 6, comparing the temperature attained in the two trials, and Figure 7, giving the pressure and temperature of the verification trial). In that trial the same packaging reached 47 °C within five days, which both proves the point about the first enclosure and, unexpectedly, strengthens the paper: at a genuine 50 °C the internal pressure rose by no more than 9–26 mbar and returned to baseline within five days, so a compliant bag absorbs thermal expansion by deforming rather than by pressurising. The central conclusion — that internal pressure is governed by stacking load and not by temperature — is therefore now supported at the temperature the first trial failed to reach, instead of resting on a null result.</w:t>
-      </w:r>
-    </w:p>
-    <w:p>
-      <w:r>
-        <w:t>We should also declare a second, instrumental point that the full record brought to light. The MEMS transducers measure absolute pressure and were not paired with a barometric reference, so every trace carries the ambient pressure of the room: in the verification trial all four sensors dip together by some 25 mbar around day 6, which is weather rather than wine. Comparisons between the top and the bottom of a stack are immune to this, since the barometric term is common to both sensors and cancels in the difference, and that is where our conclusions rest; but we now say explicitly that the absolute trajectory of a single unit should not be read as bag physics alone, and a barometric reference has been added to the recommendations in Section 3.4.</w:t>
+        <w:t>We thank Reviewer 2 and Reviewer 3 for the detailed assessment. The revision has been made conservatively. The most important change is that the main trial is no longer described as actual 50 °C wine exposure. We now distinguish chamber set point, nominal chamber condition and measured in-bag temperature throughout the manuscript. We also revised the pressure ANOVA wording as exploratory and sensor-level, and treated lactic acid descriptively because the available revision files contained inconsistent standard deviations and raw chemical replicates were unavailable.</w:t>
       </w:r>
     </w:p>
     <w:p>
       <w:pPr>
-        <w:spacing w:before="240"/>
+        <w:pStyle w:val="Heading2"/>
       </w:pPr>
       <w:r>
-        <w:rPr>
-          <w:b/>
-          <w:color w:val="1F3B73"/>
-          <w:sz w:val="28"/>
-        </w:rPr>
-        <w:t>Reviewer 1</w:t>
-      </w:r>
-    </w:p>
-    <w:p>
-      <w:pPr>
-        <w:spacing w:after="60"/>
-        <w:ind w:left="288"/>
-      </w:pPr>
-      <w:r>
-        <w:rPr>
-          <w:i/>
-          <w:color w:val="555555"/>
-        </w:rPr>
-        <w:t>Line 1–3: “Optimisation” is inconsistent with the body of the text, as no optimisation or solving for optimal conditions was actually performed. A more appropriate wording is suggested.</w:t>
-      </w:r>
-    </w:p>
-    <w:p>
-      <w:pPr>
-        <w:ind w:left="288"/>
-      </w:pPr>
-      <w:r>
-        <w:rPr>
-          <w:b/>
-        </w:rPr>
-        <w:t xml:space="preserve">Response: </w:t>
-      </w:r>
-      <w:r>
-        <w:t>We agree. No optimisation problem was posed and none was solved. The title now reads “Effect of Palletisation and Temperature on Bag-in-Box Wine Packaging under Simulated Export Conditions”, and the words “optimise” and “optimisation” have been removed from the abstract, the aim and the conclusions, where they have been replaced by wording that describes what the study actually did, namely quantify the effect of two factors.</w:t>
-      </w:r>
-    </w:p>
-    <w:p>
-      <w:pPr>
-        <w:spacing w:after="60"/>
-        <w:ind w:left="288"/>
-      </w:pPr>
-      <w:r>
-        <w:rPr>
-          <w:i/>
-          <w:color w:val="555555"/>
-        </w:rPr>
-        <w:t>Line 77–79 and 156–159: The description of the experimental layout is internally inconsistent … Please provide a clear table of the sample structure … and whether the two temperatures were run in parallel or sequentially.</w:t>
-      </w:r>
-    </w:p>
-    <w:p>
-      <w:pPr>
-        <w:ind w:left="288"/>
-      </w:pPr>
-      <w:r>
-        <w:rPr>
-          <w:b/>
-        </w:rPr>
-        <w:t xml:space="preserve">Response: </w:t>
-      </w:r>
-      <w:r>
-        <w:t>The inconsistency was real and we apologise for it. The Materials and Methods section has been rewritten and now states the design explicitly: three independent stacks per chamber — one of four boxes (128 cm) and two of three boxes (97 cm) — each carrying one MEMS sensor in the uppermost and one in the lowermost BiB, giving six sensors per temperature and twelve in total. The two temperatures were run in parallel, in two separate climate-controlled chambers, over the same 20-day window; this is now stated in the text, in the new Table 1 and in its footnote. One bottom sensor in the 19 °C chamber did not return a complete record, so eleven of the twelve traces were available for analysis; this is now declared rather than passed over. Table 1 sets out the structure row by row (chamber, stack, boxes per stack, stack height, BiBs per box, sensor placement). Table 1 now also covers the second, verification trial described below, so that the whole experimental structure of the paper is visible in one place, and the Materials and Methods section has a new subsection 2.3 describing that trial, the statistical analyses moving to 2.4. The whole manuscript has been checked for consistency against this two-trial structure.</w:t>
-      </w:r>
-    </w:p>
-    <w:p>
-      <w:pPr>
-        <w:spacing w:after="60"/>
-        <w:ind w:left="288"/>
-      </w:pPr>
-      <w:r>
-        <w:rPr>
-          <w:i/>
-          <w:color w:val="555555"/>
-        </w:rPr>
-        <w:t>Line 80–81 and Figure 3 (line 164–169): Both the body text and the abstract state “20 days,” but the x-axis of Figure 3 extends only to day 16. Please clarify whether this is a truncation in the plot or whether pressure monitoring actually lasted 16 days, and make the data consistent with the text.</w:t>
-      </w:r>
-    </w:p>
-    <w:p>
-      <w:pPr>
-        <w:ind w:left="288"/>
-      </w:pPr>
-      <w:r>
-        <w:rPr>
-          <w:b/>
-        </w:rPr>
-        <w:t xml:space="preserve">Response: </w:t>
-      </w:r>
-      <w:r>
-        <w:t>This comment prompted us to re-examine the original acquisition files, and we found a genuine error. Monitoring did run for the full 20 days: the logger export contains 979 records at 30-minute intervals, spanning 489 hours (20.4 days). The figure published in the submitted version had been generated against the “hours” column of that export instead of the “days” column, and the series had then been cut at the sixteenth point. What the reviewer saw as “day 16” was therefore hour 16 — the first two-thirds of a single day — mislabelled as days. The consequence was not merely cosmetic: the “initial variation followed by stabilisation” that we described in the submitted version was in fact the sensor warm-up transient, and the real 20-day behaviour of the packaging had never been shown. Figure 3 has been replaced with the complete record, plotted against time in days and with pressure in mbar, and it now carries the temperature registered by the same sensors in a lower row of panels; a new Figure 5 summarises the baseline-referred pressure change on which the statistics rest, and a new Figure 4 shows the first sixteen hours on an expanded axis. Section 3.2 has been rewritten around what the full record shows: a short equilibration transient, a pressurisation phase peaking on day 4, and a slow relaxation to a steady level that persists to day 20. The abstract and the conclusions have been brought into line. We thank the reviewer for a question that turned out to matter a great deal.</w:t>
-      </w:r>
-    </w:p>
-    <w:p>
-      <w:pPr>
-        <w:spacing w:after="60"/>
-        <w:ind w:left="288"/>
-      </w:pPr>
-      <w:r>
-        <w:rPr>
-          <w:i/>
-          <w:color w:val="555555"/>
-        </w:rPr>
-        <w:t>Line 134–136: The explanation of “heat-activated secondary malolactic fermentation” does not hold (50 °C inhibits lactic acid bacteria), and it contradicts the non-significant change in malic acid; the stoichiometry also does not add up. The cited references [20,21] do not appear to be directly relevant …</w:t>
-      </w:r>
-    </w:p>
-    <w:p>
-      <w:pPr>
-        <w:ind w:left="288"/>
-      </w:pPr>
-      <w:r>
-        <w:rPr>
-          <w:b/>
-        </w:rPr>
-        <w:t xml:space="preserve">Response: </w:t>
-      </w:r>
-      <w:r>
-        <w:t>The reviewer is right and the mechanistic inference has been removed. We should add something the reviewer could not have known, and which cuts against our original text even more sharply than the comment does. As the full temperature record now shows (see the opening note), the wine in the hot chamber reached only 25–34 °C, not 50 °C. The premise that lactic acid bacteria were thermally inhibited therefore does not hold either, and we have not leaned on it. The conclusion is unchanged but now rests entirely on evidence internal to the wine: had malic acid been decarboxylated to lactic acid it would have fallen, and it did not (1.1 ± 0.23 against 1.0 ± 0.16 g/L, not significant); the increase of roughly 0.13 g/L in lactic acid has no stoichiometric counterpart in the malic acid data; and with a standard deviation of ± 0.20 g/L on a mean of 0.29 g/L the difference sits at the limit of what the method resolves at these concentrations. We attribute it to heat-driven chemical change together with analytical variability. The two references that were not pertinent have been replaced by studies dealing directly with wine composition under elevated storage temperature.</w:t>
-      </w:r>
-    </w:p>
-    <w:p>
-      <w:pPr>
-        <w:spacing w:after="60"/>
-        <w:ind w:left="288"/>
-      </w:pPr>
-      <w:r>
-        <w:rPr>
-          <w:i/>
-          <w:color w:val="555555"/>
-        </w:rPr>
-        <w:t>Line 139–142: Attributing the increase in volatile acidity to “microbiological instability” is not reasonable at 50 °C; it is suggested to reframe this as heat-accelerated chemical reactions. It may also be noted that 0.39 g/L is still below the sensory threshold …</w:t>
-      </w:r>
-    </w:p>
-    <w:p>
-      <w:pPr>
-        <w:ind w:left="288"/>
-      </w:pPr>
-      <w:r>
-        <w:rPr>
-          <w:b/>
-        </w:rPr>
-        <w:t xml:space="preserve">Response: </w:t>
-      </w:r>
-      <w:r>
-        <w:t>Reframed as suggested: the paragraph now ascribes the rise to heat-accelerated chemical reactions — the oxidation of ethanol and the hydrolysis of esters and other acetyl compounds — and no longer invokes microbiological instability. For the same reason as above we have not argued this from the temperature, since the wine reached 25–34 °C rather than 50 °C; the attribution rests instead on the magnitude of the change, which is small (0.09 g/L over twenty days), and on its consistency with the SO₂ loss measured in the same samples. We have added that 0.39 g/L sits well below the customary sensory threshold for acetic acid in wine (about 0.7 g/L) and far below the regulatory limit, so the practical consequence over this transport window is limited. We would welcome the reviewer’s view on whether a microbiological contribution should be explicitly excluded at these temperatures or simply left open.</w:t>
-      </w:r>
-    </w:p>
-    <w:p>
-      <w:pPr>
-        <w:spacing w:after="60"/>
-        <w:ind w:left="288"/>
-      </w:pPr>
-      <w:r>
-        <w:rPr>
-          <w:i/>
-          <w:color w:val="555555"/>
-        </w:rPr>
-        <w:t>Line 155: The section heading “3.2 Pyisical parameters” contains a spelling error and should read “Physical.”</w:t>
-      </w:r>
-    </w:p>
-    <w:p>
-      <w:pPr>
-        <w:ind w:left="288"/>
-      </w:pPr>
-      <w:r>
-        <w:rPr>
-          <w:b/>
-        </w:rPr>
-        <w:t xml:space="preserve">Response: </w:t>
-      </w:r>
-      <w:r>
-        <w:t>Corrected.</w:t>
-      </w:r>
-    </w:p>
-    <w:p>
-      <w:pPr>
-        <w:spacing w:after="60"/>
-        <w:ind w:left="288"/>
-      </w:pPr>
-      <w:r>
-        <w:rPr>
-          <w:i/>
-          <w:color w:val="555555"/>
-        </w:rPr>
-        <w:t>Line 159–162: … could the initial fluctuations originate from thermal equilibration of the sensors/electronic components or from battery effects, rather than from genuine pressure dynamics within the wine bags? Please discuss this.</w:t>
-      </w:r>
-    </w:p>
-    <w:p>
-      <w:pPr>
-        <w:ind w:left="288"/>
-      </w:pPr>
-      <w:r>
-        <w:rPr>
-          <w:b/>
-        </w:rPr>
-        <w:t xml:space="preserve">Response: </w:t>
-      </w:r>
-      <w:r>
-        <w:t>The reviewer’s instinct that this interval is not the wine speaking is right, but the mechanism turns out to be a different one, and checking it against our own hardware was useful. The electronics can be excluded: the sensing unit draws less than 1 mA and sits in an oil-filled casing that disperses what little heat it produces, so neither self-heating nor battery behaviour is visible in the data. What the interval actually contains is handling. The instrumented bags were filled at the manufacturer and driven by car to the laboratory, so the temperature around them and the ambient pressure both varied in transit, and the filling and sealing machinery disturbs the units mechanically as well; the step in pressure at the fifth hour is the moment the boxes were assembled into their stacks and the vertical load came on. A new Figure 4 now shows the first sixteen hours on an expanded axis — the units arrive at about 28 °C, cool to some 13 °C and only then begin to warm towards their chamber — and Section 3.2 sets this out. The interval is excluded from the quantitative comparison and the limitation is recorded in Section 3.4. We would add one caveat the reviewer may find relevant: with one reading every 30 minutes this part of the record is sampled too coarsely to resolve rapid variation, so only its overall shape can be interpreted.</w:t>
-      </w:r>
-    </w:p>
-    <w:p>
-      <w:pPr>
-        <w:spacing w:after="60"/>
-        <w:ind w:left="288"/>
-      </w:pPr>
-      <w:r>
-        <w:rPr>
-          <w:i/>
-          <w:color w:val="555555"/>
-        </w:rPr>
-        <w:t>Table 1 … (1) Decimal points and commas are used inconsistently; (2) the number of significant figures is inconsistent across columns; (3) only the two temperature groups are included, with no top/bottom position or stack height … (4) “leĴers” … and the body text (p ≤ 0.05) is inconsistent with the table note (p &lt; 0.05).</w:t>
-      </w:r>
-    </w:p>
-    <w:p>
-      <w:pPr>
-        <w:ind w:left="288"/>
-      </w:pPr>
-      <w:r>
-        <w:rPr>
-          <w:b/>
-        </w:rPr>
-        <w:t xml:space="preserve">Response: </w:t>
-      </w:r>
-      <w:r>
-        <w:t>The chemical table is now Table 2, the new Table 1 being the sample-structure table requested above. (1) All decimal commas have been converted to points. (2) Significant figures have been made consistent within each column. (3) We have to be candid here: the chemical analyses were performed on the wine as a bulk sample and were never resolved by stack position or stack height, so the table cannot be extended in that direction without new experimental work. Rather than let the conclusions rest on an association the data cannot support, we have removed the claim of a palletisation–chemistry link. The revised manuscript separates the two effects: palletisation acts on the internal pressure, temperature acts on the composition, and the absence of position-resolved chemistry is stated in the Results and listed in Section 3.4. (4) The encoding error is fixed and the note now reads p ≤ 0.05, matching the text.</w:t>
-      </w:r>
-    </w:p>
-    <w:p>
-      <w:pPr>
-        <w:spacing w:after="60"/>
-        <w:ind w:left="288"/>
-      </w:pPr>
-      <w:r>
-        <w:rPr>
-          <w:i/>
-          <w:color w:val="555555"/>
-        </w:rPr>
-        <w:t>Throughout the manuscript there are numerous issues with tense/collocation and spelling … a thorough professional language edit of the whole text is recommended.</w:t>
-      </w:r>
-    </w:p>
-    <w:p>
-      <w:pPr>
-        <w:ind w:left="288"/>
-      </w:pPr>
-      <w:r>
-        <w:rPr>
-          <w:b/>
-        </w:rPr>
-        <w:t xml:space="preserve">Response: </w:t>
-      </w:r>
-      <w:r>
-        <w:t>The manuscript has been edited throughout. “Previously study”, “Pyisical” and the other errors noted have been corrected, tenses have been made consistent (past for what was done and observed, present for what holds generally), and terminology has been unified — “BiB”, “stack”, “top/bottom position” and “storage temperature” are now used in the same sense everywhere. We have also taken the opportunity to put the manuscript properly into the journal template: the section and sub-section headings, the figure and table captions and the body text now carry the MDPI styles rather than the default ones they had been given, in-text callouts read “Figure 1” instead of “Fig. 1”, and the reference list has been made internally consistent, with the journal name in italic and the year in bold throughout, including the entries that were added during this revision.</w:t>
-      </w:r>
-    </w:p>
-    <w:p>
-      <w:pPr>
-        <w:spacing w:before="240"/>
-      </w:pPr>
-      <w:r>
-        <w:rPr>
-          <w:b/>
-          <w:color w:val="1F3B73"/>
-          <w:sz w:val="28"/>
-        </w:rPr>
         <w:t>Reviewer 2</w:t>
       </w:r>
     </w:p>
     <w:p>
       <w:pPr>
-        <w:spacing w:after="60"/>
-        <w:ind w:left="288"/>
+        <w:pStyle w:val="Heading3"/>
       </w:pPr>
       <w:r>
-        <w:rPr>
-          <w:i/>
-          <w:color w:val="555555"/>
-        </w:rPr>
-        <w:t>The manuscript does not specify the wine variety, vintage, initial chemical parameters. More information on BiB material properties should be given.</w:t>
+        <w:t>R2.1 Main trial did not achieve 50 °C</w:t>
+      </w:r>
+    </w:p>
+    <w:p>
+      <w:r>
+        <w:t>Reviewer Comment: The chamber was set at 50 °C, but the wine experienced about 25-34 °C; this changes the hypothesis test.</w:t>
+      </w:r>
+    </w:p>
+    <w:p>
+      <w:r>
+        <w:t>Response: We agree. The original wording could imply that the wine in the main trial was exposed to 50 °C, which was not the case. The manuscript now states that the 50 °C value was a nominal chamber set point and that measured in-bag temperatures reached about 33.6 ± 1.5 °C in top units and 25.5 ± 0.9 °C in bottom units. The realised study is interpreted as a comparison between nominal chamber conditions and actual package temperatures.</w:t>
+      </w:r>
+    </w:p>
+    <w:p>
+      <w:r>
+        <w:t>Changes in Manuscript: Title, Abstract, Sections 2, 3.1, 3.2, 3.4, Conclusions, captions and Table 2 were revised to use nominal chamber condition and measured in-bag temperature terminology.</w:t>
       </w:r>
     </w:p>
     <w:p>
       <w:pPr>
-        <w:ind w:left="288"/>
+        <w:pStyle w:val="Heading3"/>
       </w:pPr>
       <w:r>
-        <w:rPr>
-          <w:b/>
-        </w:rPr>
-        <w:t xml:space="preserve">Response: </w:t>
+        <w:t>R2.2 Abstract</w:t>
       </w:r>
+    </w:p>
+    <w:p>
       <w:r>
-        <w:t>The wine has now been identified as a commercial white wine supplied by Castellani S.p.A., packaged in standard 3-L Bag-in-Box units of the type used for commercial export. We must, however, be straightforward about a limitation: the grape variety and the vintage were not disclosed to us, because the product was supplied as a finished commercial wine. We have said so in the Materials and Methods rather than leave the omission unexplained, and we have noted it again in Section 3.4. Since the object of the study was the behaviour of the packaging under palletisation and heat, and not the varietal character of the wine, we do not believe this affects the interpretation, though it does limit generalisation to other products. The initial composition is that of the 19 °C reference in Table 2, and this is now stated explicitly. The description of the BiB has been expanded: a flexible multilayer film with an oxygen-barrier layer and an integrated dispensing valve, housed in a corrugated cardboard case that carries the mechanical load during palletisation.</w:t>
+        <w:t>Reviewer Comment: The Abstract should be condensed, restructured and explicit about the actual temperatures.</w:t>
+      </w:r>
+    </w:p>
+    <w:p>
+      <w:r>
+        <w:t>Response: The Abstract has been rewritten. It now reports the actual in-bag temperatures, the pressure effect estimate, the absence of a statistically detectable nominal chamber-condition effect, the scope of the bulk chemistry data and the limited role of the verification trial.</w:t>
+      </w:r>
+    </w:p>
+    <w:p>
+      <w:r>
+        <w:t>Changes in Manuscript: Abstract fully rewritten.</w:t>
       </w:r>
     </w:p>
     <w:p>
       <w:pPr>
-        <w:spacing w:after="60"/>
-        <w:ind w:left="288"/>
+        <w:pStyle w:val="Heading3"/>
       </w:pPr>
       <w:r>
-        <w:rPr>
-          <w:i/>
-          <w:color w:val="555555"/>
-        </w:rPr>
-        <w:t>How were MEMS sensors inserted into wine-filled bags? Was the bag punctured and resealed? Did insertion create leakage risk or alter internal pressure?</w:t>
+        <w:t>R2.3 Chamber characteristics</w:t>
+      </w:r>
+    </w:p>
+    <w:p>
+      <w:r>
+        <w:t>Reviewer Comment: Chamber model, air circulation, fan power, chamber volume and pallet occupancy should be provided.</w:t>
+      </w:r>
+    </w:p>
+    <w:p>
+      <w:r>
+        <w:t>Response: We searched the repository and available notes. These details were not recorded in the available experimental record. We have not invented specifications. Instead, we now state that these chamber characteristics are unavailable and that this limits the diagnosis of the thermal lag and vertical gradient observed in the main trial.</w:t>
+      </w:r>
+    </w:p>
+    <w:p>
+      <w:r>
+        <w:t>Changes in Manuscript: Added this limitation in Materials and Methods and Section 3.4.</w:t>
       </w:r>
     </w:p>
     <w:p>
       <w:pPr>
-        <w:ind w:left="288"/>
+        <w:pStyle w:val="Heading3"/>
       </w:pPr>
       <w:r>
-        <w:rPr>
-          <w:b/>
-        </w:rPr>
-        <w:t xml:space="preserve">Response: </w:t>
+        <w:t>R2.4 Small sample size and ANOVA power</w:t>
       </w:r>
+    </w:p>
+    <w:p>
       <w:r>
-        <w:t>The bag was not punctured. The sensor assembly — an MS5803-05BA transducer, an ESP8285 microcontroller and a lithium battery in an oil-filled plastic casing — was introduced through the existing filling/dispensing valve before the bag was finally sealed, so the multilayer film and its barrier layer were never breached. Sealing then followed the standard procedure of the filling line. There was therefore no leakage path and no artificial perturbation of the internal pressure. This is now described in Section 2.2.</w:t>
+        <w:t>Reviewer Comment: The pressure ANOVA has very limited power because n is small and one bottom sensor is missing.</w:t>
+      </w:r>
+    </w:p>
+    <w:p>
+      <w:r>
+        <w:t>Response: We agree. The revised manuscript now states the pressure cell sizes (n = 3, 3, 3 and 2), the missing sensor, the unbalanced design and the limited power. We retained the two-way ANOVA because it is the analysis used for the embedded pressure summaries, but interpret it as an exploratory sensor-level analysis and report effect estimates and confidence intervals alongside p-values. Because stack identifiers are not retained in the embedded summary table, the p-values are not presented as definitive stack-level tests.</w:t>
+      </w:r>
+    </w:p>
+    <w:p>
+      <w:r>
+        <w:t>Changes in Manuscript: Sections 2.2, 2.4, 3.2, 3.4 and Conclusions revised. `anova_pressure.py` was updated and `analysis_verification.md` added.</w:t>
       </w:r>
     </w:p>
     <w:p>
       <w:pPr>
-        <w:spacing w:after="60"/>
-        <w:ind w:left="288"/>
+        <w:pStyle w:val="Heading3"/>
       </w:pPr>
       <w:r>
-        <w:rPr>
-          <w:i/>
-          <w:color w:val="555555"/>
-        </w:rPr>
-        <w:t>The authors state that six MEMS sensors were used corresponding to three independent stack configurations (n=3). However, it is unclear whether the reported pressure values represent true biological/technical replicates or repeated measures from the same stacks. The degree of independence between replicates needs clarification.</w:t>
+        <w:t>R2.5 Verification trial n=1 stack</w:t>
+      </w:r>
+    </w:p>
+    <w:p>
+      <w:r>
+        <w:t>Reviewer Comment: The verification trial cannot confirm general conclusions because it used only one stack and one sensor failed.</w:t>
+      </w:r>
+    </w:p>
+    <w:p>
+      <w:r>
+        <w:t>Response: We agree. All confirmatory language has been removed. The verification trial is now described as a limited supporting observation under one three-box-stack configuration. The manuscript explicitly states that it cannot establish a general position effect.</w:t>
+      </w:r>
+    </w:p>
+    <w:p>
+      <w:r>
+        <w:t>Changes in Manuscript: Sections 2.3, 3.3, 3.4 and Conclusions revised.</w:t>
       </w:r>
     </w:p>
     <w:p>
       <w:pPr>
-        <w:ind w:left="288"/>
+        <w:pStyle w:val="Heading3"/>
       </w:pPr>
       <w:r>
-        <w:rPr>
-          <w:b/>
-        </w:rPr>
-        <w:t xml:space="preserve">Response: </w:t>
+        <w:t>R2.6 Physical-vs-chemical binary conclusion</w:t>
       </w:r>
+    </w:p>
+    <w:p>
       <w:r>
-        <w:t>The replicates are independent units, not repeated measures. Each chamber contained three stacks that were built and filled separately, and each stack carried its own two sensors, one at the top and one at the bottom. Every trace therefore comes from a different sensor in a different BiB in a different stack, and n = 3 refers to three independent stacks per position and temperature. Section 2.2 now states this. We have also added a methodological point that the reviewer’s question brought into focus. The transducer has now been identified precisely in the text (MS5803-05BA, TE Connectivity) and its specification taken from the data sheet, which is cited as reference [24]: it is guaranteed to ±1.5 mbar between 300 and 1100 mbar at 20 °C, a tolerance that widens to ±100 mbar over the full 0–5 bar and 0–50 °C envelope, while resolving 0.036–0.195 mbar and holding ±1 mbar per year. Absolute readings from different sensors are therefore not directly comparable, whereas the change measured by one sensor against its own baseline is reliable, and the analysis is performed on that quantity. On that basis a two-way analysis of variance on the peak ΔP identifies stack position as the only significant factor (F(1,8) = 9.14; p = 0.017), the bottom units developing about 21 mbar more than the top ones at the pressurisation peak. Since the design carries two factors at once, Section 2.4 now sets the method out properly rather than merely naming it: the linear model is given as Equation (1) and the variance ratio as Equation (2), with each term defined, the degrees of freedom derived (which is where F(1,8) comes from), and the standard treatment cited [26]. We also explain a choice the unbalanced design forces on us — one bottom sensor at 19 °C returned no record, so the four cells hold three, three, three and two units — and the sums of squares are accordingly computed by the Type II method, which is the recommended option for unbalanced data with a non-significant interaction [27]. The computation was carried out with the statsmodels package [28], and the commented script that derives the summary values from the raw records and reproduces every F ratio reported in the paper is available to the editor and the reviewers on request; it is named in the Data Availability Statement. We should add that this advantage proves transient: by day 20 the units have converged and neither factor is significant (position, p = 0.57; temperature, p = 0.39), which we now report and interpret as the flexible bag accommodating the load rather than sustaining it.</w:t>
+        <w:t>Reviewer Comment: The claim that palletisation governs physical behaviour and temperature governs chemical stability is overreaching because chemistry was not position-resolved.</w:t>
+      </w:r>
+    </w:p>
+    <w:p>
+      <w:r>
+        <w:t>Response: We agree. The revised manuscript no longer presents this binary causal attribution. It now states that pressure was position-resolved and showed a transient bottom-position peak, whereas chemistry was measured as bulk wine grouped by nominal chamber condition and cannot be linked directly to stack position.</w:t>
+      </w:r>
+    </w:p>
+    <w:p>
+      <w:r>
+        <w:t>Changes in Manuscript: Abstract, Section 3.2, Limitations and Conclusions revised.</w:t>
       </w:r>
     </w:p>
     <w:p>
       <w:pPr>
-        <w:spacing w:after="60"/>
-        <w:ind w:left="288"/>
+        <w:pStyle w:val="Heading3"/>
       </w:pPr>
       <w:r>
-        <w:rPr>
-          <w:i/>
-          <w:color w:val="555555"/>
-        </w:rPr>
-        <w:t>While 50°C is described as “representative of critical conditions found in non-refrigerated containers,” no citation is provided to support that this temperature is routinely reached inside shipping containers during ocean transport.</w:t>
+        <w:t>R2.7 Lactic acid interpretation</w:t>
+      </w:r>
+    </w:p>
+    <w:p>
+      <w:r>
+        <w:t>Reviewer Comment: The lactic-acid increase cannot be confidently attributed to heat-driven chemistry rather than malolactic fermentation without microbiological data.</w:t>
+      </w:r>
+    </w:p>
+    <w:p>
+      <w:r>
+        <w:t>Response: We agree. The manuscript no longer states that malolactic fermentation was ruled out. During revision we also found that the available files contained inconsistent standard deviations for lactic acid in the nominal 50 °C chamber (0.02 versus 0.20 g/L), while the raw chemical replicates were not available. We therefore revised Table 2 conservatively to use 0.29 ± 0.20 g/L, assigned the same significance letter to both lactic-acid means, and now treat lactic acid descriptively rather than as an independently verified significant difference. We retained the observation that malic acid did not decrease significantly, but we now state that no microbiological analyses, viable cell counts or method-sensitivity study were available and that residual microbial activity cannot be excluded.</w:t>
+      </w:r>
+    </w:p>
+    <w:p>
+      <w:r>
+        <w:t>Changes in Manuscript: Sections 2.4 and 3.1, Table 2 and Limitations revised.</w:t>
       </w:r>
     </w:p>
     <w:p>
       <w:pPr>
-        <w:ind w:left="288"/>
+        <w:pStyle w:val="Heading3"/>
       </w:pPr>
       <w:r>
-        <w:rPr>
-          <w:b/>
-        </w:rPr>
-        <w:t xml:space="preserve">Response: </w:t>
+        <w:t>R2.8 Table 2 labels</w:t>
       </w:r>
+    </w:p>
+    <w:p>
       <w:r>
-        <w:t>A citation has been added [15]. We have also moderated the wording: 50 °C is presented as a deliberately severe, worst-case value rather than as a routine one, and Section 3.4 now records that real shipments experience fluctuating rather than constant temperatures.</w:t>
+        <w:t>Reviewer Comment: "Wine at 19 °C" and "Wine at 50 °C" are misleading.</w:t>
+      </w:r>
+    </w:p>
+    <w:p>
+      <w:r>
+        <w:t>Response: Corrected. The row labels now read "Wine from nominal 19 °C chamber" and "Wine from nominal 50 °C chamber." The caption and table note clarify that these labels are chamber set points, not actual wine temperatures.</w:t>
+      </w:r>
+    </w:p>
+    <w:p>
+      <w:r>
+        <w:t>Changes in Manuscript: Table 2 labels, caption and note revised.</w:t>
       </w:r>
     </w:p>
     <w:p>
       <w:pPr>
-        <w:spacing w:after="60"/>
-        <w:ind w:left="288"/>
+        <w:pStyle w:val="Heading3"/>
       </w:pPr>
       <w:r>
-        <w:rPr>
-          <w:i/>
-          <w:color w:val="555555"/>
-        </w:rPr>
-        <w:t>The 20-day storage period is used without justification.</w:t>
+        <w:t>R2.9 First five hours excluded</w:t>
+      </w:r>
+    </w:p>
+    <w:p>
+      <w:r>
+        <w:t>Reviewer Comment: The first five hours may represent realistic transport disturbances and should be discussed or tested by sensitivity analysis.</w:t>
+      </w:r>
+    </w:p>
+    <w:p>
+      <w:r>
+        <w:t>Response: We agree that these early transients may be relevant to some logistics scenarios. The revised manuscript explains why the interval was excluded from the primary storage analysis: it contained transport from the filling line, filling/sealing and stack assembly, and was sampled only every 30 minutes. A full-record sensitivity analysis could not be recomputed from the repository because the raw logger export is absent. We now state this limitation explicitly rather than implying that the exclusion is consequence-free.</w:t>
+      </w:r>
+    </w:p>
+    <w:p>
+      <w:r>
+        <w:t>Changes in Manuscript: Section 3.2 and Limitations revised; `analysis_verification.md` documents the missing raw-data constraint.</w:t>
       </w:r>
     </w:p>
     <w:p>
       <w:pPr>
-        <w:ind w:left="288"/>
+        <w:pStyle w:val="Heading3"/>
       </w:pPr>
       <w:r>
-        <w:rPr>
-          <w:b/>
-        </w:rPr>
-        <w:t xml:space="preserve">Response: </w:t>
+        <w:t>R2.10 Wine identity</w:t>
       </w:r>
+    </w:p>
+    <w:p>
       <w:r>
-        <w:t>The justification is now given in the Materials and Methods: 20 days approximates the duration of transoceanic shipment to distant markets such as the United States, which typically takes two to four weeks [15]. The revised Figure 3 shows the whole of that window.</w:t>
+        <w:t>Reviewer Comment: Grape variety and vintage are unknown.</w:t>
+      </w:r>
+    </w:p>
+    <w:p>
+      <w:r>
+        <w:t>Response: Correct. The supplier did not provide grape variety or vintage information. We have retained this statement and list it as a limitation.</w:t>
+      </w:r>
+    </w:p>
+    <w:p>
+      <w:r>
+        <w:t>Changes in Manuscript: Materials and Methods and Limitations revised.</w:t>
       </w:r>
     </w:p>
     <w:p>
       <w:pPr>
-        <w:spacing w:after="60"/>
-        <w:ind w:left="288"/>
+        <w:pStyle w:val="Heading2"/>
       </w:pPr>
       <w:r>
-        <w:rPr>
-          <w:i/>
-          <w:color w:val="555555"/>
-        </w:rPr>
-        <w:t>Chemical and physical indicators influence each other. Add some discussion to link them.</w:t>
-      </w:r>
-    </w:p>
-    <w:p>
-      <w:pPr>
-        <w:ind w:left="288"/>
-      </w:pPr>
-      <w:r>
-        <w:rPr>
-          <w:b/>
-        </w:rPr>
-        <w:t xml:space="preserve">Response: </w:t>
-      </w:r>
-      <w:r>
-        <w:t>A paragraph linking the two has been added at the end of Section 3.2, though the corrected data led us to a different conclusion from the one we had expected. The two responses are driven by different factors rather than by each other: the internal pressure is governed by vertical load, with the bottom units consistently more pressurised than the top ones and no resolvable contribution from temperature (F(1,8) = 0.21; p = 0.66), whereas the compositional changes are governed by temperature alone. We now discuss the practical implication of that separation — that the two variables have to be controlled independently — and we are careful not to imply a chemical signature of palletisation, since the chemistry was not resolved by position.</w:t>
-      </w:r>
-    </w:p>
-    <w:p>
-      <w:pPr>
-        <w:spacing w:after="60"/>
-        <w:ind w:left="288"/>
-      </w:pPr>
-      <w:r>
-        <w:rPr>
-          <w:i/>
-          <w:color w:val="555555"/>
-        </w:rPr>
-        <w:t>Include a section on the limitations and future research outlook of this study.</w:t>
-      </w:r>
-    </w:p>
-    <w:p>
-      <w:pPr>
-        <w:ind w:left="288"/>
-      </w:pPr>
-      <w:r>
-        <w:rPr>
-          <w:b/>
-        </w:rPr>
-        <w:t xml:space="preserve">Response: </w:t>
-      </w:r>
-      <w:r>
-        <w:t>Section 3.4, “Limitations and future perspectives”, has been added. It covers the single wine and single format, the undisclosed variety and vintage, the constant-temperature design, the absence of position-resolved chemistry, the sensor accuracy over the full range and the limited power of a three-stack design to detect a small thermal effect, the narrow range of stack heights, and the sensor settling transient. It also sets out what should come next: more wines and formats, stack heights extended towards full pallet loads, realistic fluctuating temperature and vibration profiles, and position-resolved sampling paired with position-resolved pressure.</w:t>
-      </w:r>
-    </w:p>
-    <w:p>
-      <w:pPr>
-        <w:spacing w:after="60"/>
-        <w:ind w:left="288"/>
-      </w:pPr>
-      <w:r>
-        <w:rPr>
-          <w:i/>
-          <w:color w:val="555555"/>
-        </w:rPr>
-        <w:t>Revise reference styles carefully. For example, no page numbers for reference 6.</w:t>
-      </w:r>
-    </w:p>
-    <w:p>
-      <w:pPr>
-        <w:ind w:left="288"/>
-      </w:pPr>
-      <w:r>
-        <w:rPr>
-          <w:b/>
-        </w:rPr>
-        <w:t xml:space="preserve">Response: </w:t>
-      </w:r>
-      <w:r>
-        <w:t>The reference list has been checked against the journal style. Reference 6 is an article-number publication and now carries its article number, and references 7 and 14 have been completed. The two references that were not pertinent to the malolactic discussion have been replaced by Scrimgeour et al. (2015) and Hopfer et al. (2013). Five references have been added in the course of this revision and follow the same style: the data sheets of the two devices, now that the instrumentation is identified precisely (MS5803-05BA [24] and the ESP-M2/ESP8285 board [25]), and three sources for the statistical treatment — Montgomery for the two-way model and the F test [26], Langsrud for the use of Type II sums of squares with unbalanced data [27] and the statsmodels package [28]. The list now runs to 28 entries, and we have made the whole of it internally consistent, with the journal name in italic and the year in bold throughout — including the entries that had been added earlier and did not follow the pattern.</w:t>
-      </w:r>
-    </w:p>
-    <w:p>
-      <w:pPr>
-        <w:spacing w:before="240"/>
-      </w:pPr>
-      <w:r>
-        <w:rPr>
-          <w:b/>
-          <w:color w:val="1F3B73"/>
-          <w:sz w:val="28"/>
-        </w:rPr>
         <w:t>Reviewer 3</w:t>
       </w:r>
     </w:p>
     <w:p>
       <w:pPr>
-        <w:spacing w:after="60"/>
-        <w:ind w:left="288"/>
+        <w:pStyle w:val="Heading3"/>
       </w:pPr>
       <w:r>
-        <w:rPr>
-          <w:i/>
-          <w:color w:val="555555"/>
-        </w:rPr>
-        <w:t>1) The introduction describes the advantages of using the selected packaging … However, there is no mention of studies on wine storage in similar packaging, what factors have already been studied … The hypothesis and the purpose of this study are not clear …</w:t>
+        <w:t>R3.1 Stacking configuration and interpretability</w:t>
+      </w:r>
+    </w:p>
+    <w:p>
+      <w:r>
+        <w:t>Reviewer Comment: It is difficult to evaluate stacking configuration because different configurations and temperatures may be confounded or averaged.</w:t>
+      </w:r>
+    </w:p>
+    <w:p>
+      <w:r>
+        <w:t>Response: We appreciate this point. The revised manuscript clarifies that the pressure analysis tested top versus bottom package position under the tested stack configuration. Stack height was not analysed as an independent factor because only one four-box stack and two three-box stacks were present per chamber. We also state that chamber condition is unreplicated at chamber level, and that the pressure ANOVA is an exploratory sensor-level analysis rather than a definitive paired stack-level test.</w:t>
+      </w:r>
+    </w:p>
+    <w:p>
+      <w:r>
+        <w:t>Changes in Manuscript: Figure 2 caption, Table 1 note, Sections 2.2, 2.4, 3.4 and Conclusions revised.</w:t>
       </w:r>
     </w:p>
     <w:p>
       <w:pPr>
-        <w:ind w:left="288"/>
+        <w:pStyle w:val="Heading3"/>
       </w:pPr>
       <w:r>
-        <w:rPr>
-          <w:b/>
-        </w:rPr>
-        <w:t xml:space="preserve">Response: </w:t>
+        <w:t>R3.2 SO₂ reduction and post-transport shelf life</w:t>
       </w:r>
+    </w:p>
+    <w:p>
       <w:r>
-        <w:t>A paragraph has been added to the end of the Introduction. It summarises what is already known about storage temperature and packaging — that heat accelerates the loss of sulphur dioxide and the development of volatile acidity, and that the barrier properties of the container condition the rate of these reactions — and then identifies the gap: this evidence concerns bottled wine or static storage, whereas the behaviour of BiB units that are palletised and simultaneously exposed to heat and vertical load has not been described, and the internal pressure of the flexible bag has not been measured at all. The aim and the hypothesis are now stated in so many words: we tested whether stacking configuration and storage temperature measurably affect the internal pressure and the chemical stability of 3-L BiB units, expecting both a higher temperature and a greater vertical load to raise the internal pressure. The reader can now judge the outcome against that expectation — and, as it turned out, only half of it was borne out.</w:t>
+        <w:t>Reviewer Comment: Could SO₂ loss affect shelf life and storage after transport?</w:t>
+      </w:r>
+    </w:p>
+    <w:p>
+      <w:r>
+        <w:t>Response: We now discuss this conservatively. The wine from the nominally warmer chamber had lower total and free SO₂ values after 20 days than the reference-chamber wine. This may indicate a lower antioxidant and antimicrobial reserve available after transport, but actual shelf life, sensory quality and microbial stability after transport were not measured. We therefore present post-transport storage impact as a potential implication, not a measured outcome.</w:t>
+      </w:r>
+    </w:p>
+    <w:p>
+      <w:r>
+        <w:t>Changes in Manuscript: Section 3.1, Limitations and Conclusions revised.</w:t>
       </w:r>
     </w:p>
     <w:p>
       <w:pPr>
-        <w:spacing w:after="60"/>
-        <w:ind w:left="288"/>
+        <w:pStyle w:val="Heading3"/>
       </w:pPr>
       <w:r>
-        <w:rPr>
-          <w:i/>
-          <w:color w:val="555555"/>
-        </w:rPr>
-        <w:t>2) … the general conclusions from this data are obvious and have already been studied … The fact that sulfur oxide content or volatile acidity changes is not new … Perhaps it’s worth paying attention to the parameters that remained stable and why … How critical is a change in the studied parameters at these values? If the changes are critical, what should be done?</w:t>
+        <w:t>R3.3 Economic feasibility of pressure sensors</w:t>
+      </w:r>
+    </w:p>
+    <w:p>
+      <w:r>
+        <w:t>Reviewer Comment: The feasibility of using pressure sensors at scale is unclear.</w:t>
+      </w:r>
+    </w:p>
+    <w:p>
+      <w:r>
+        <w:t>Response: We agree that the original recommendation was too broad. The revised manuscript does not recommend instrumenting every commercial BiB. It now frames sensor use as selected sentinel packages, validation deployments or quality-control monitoring. We also state that no techno-economic analysis was performed.</w:t>
+      </w:r>
+    </w:p>
+    <w:p>
+      <w:r>
+        <w:t>Changes in Manuscript: Limitations and Conclusions revised.</w:t>
       </w:r>
     </w:p>
     <w:p>
       <w:pPr>
-        <w:ind w:left="288"/>
+        <w:pStyle w:val="Heading3"/>
       </w:pPr>
       <w:r>
-        <w:rPr>
-          <w:b/>
-        </w:rPr>
-        <w:t xml:space="preserve">Response: </w:t>
+        <w:t>R3.4 Thermal behaviour under nominal 19 °C and 50 °C conditions</w:t>
       </w:r>
+    </w:p>
+    <w:p>
       <w:r>
-        <w:t>We accept the criticism: taken alone, the loss of SO₂ and the rise in volatile acidity at 50 °C are expected, and the two papers the reviewer cites are now included in the Introduction and in the discussion of the organic acids. The discussion has been reorganised along the lines suggested. It now emphasises what did not change — pH, titratable acidity, ethanol and total phenols were all statistically unchanged, so the acid–base framework, the alcoholic strength and the phenolic pool survived even this regime — and it weighs the magnitude of what did. Volatile acidity reached 0.39 g/L, below the sensory threshold of about 0.7 g/L, so it is not of practical concern over this window. Free SO₂ fell from 31 to 16 mg/L, roughly half the reserve, and this is the one change we regard as critical, because it is the antioxidant and antimicrobial buffer that has to last for the rest of the product’s life, not only for the voyage. The corresponding recommendation — temperature control during transit, since the depletion is thermal and no packaging arrangement compensates for it — is now stated in the conclusions. We would add that the novelty of the work does not lie in the chemistry but in the pressure measurement inside the bag, which had not previously been reported and which produced the result we did not anticipate (see below).</w:t>
+        <w:t>Reviewer Comment: The nominal 50 °C packages stayed below set point, whereas the nominal 19 °C packages reached about 23 °C; this different behaviour needs explanation.</w:t>
+      </w:r>
+    </w:p>
+    <w:p>
+      <w:r>
+        <w:t>Response: We now quantify both observations and distinguish facts from hypotheses. The manuscript states that the nominal 19 °C packages stabilised around 23 °C and the nominal 50 °C packages stabilised at about 34 °C top and 26 °C bottom. Thermal inertia, chamber loading, limited heat transfer and airflow constraints are described as plausible explanations only, because chamber specifications and airflow data were not recorded.</w:t>
+      </w:r>
+    </w:p>
+    <w:p>
+      <w:r>
+        <w:t>Changes in Manuscript: Sections 3.2, 3.3 and Limitations revised.</w:t>
       </w:r>
     </w:p>
     <w:p>
       <w:pPr>
-        <w:spacing w:after="60"/>
-        <w:ind w:left="288"/>
+        <w:pStyle w:val="Heading3"/>
       </w:pPr>
       <w:r>
-        <w:rPr>
-          <w:i/>
-          <w:color w:val="555555"/>
-        </w:rPr>
-        <w:t>3) The conclusion uses general terms that in no way characterize either the novelty or the practical significance … If the title mentions “optimization,” then what are the optimal transportation conditions … Based on the data obtained, it seems that pallet size is not important. So why were two different palletization options studied? To confirm that it has no effect? And how necessary is it really to monitor pressure during transportation? …</w:t>
+        <w:t>R3.5 Main experiment versus verification experiment discrepancy</w:t>
+      </w:r>
+    </w:p>
+    <w:p>
+      <w:r>
+        <w:t>Reviewer Comment: The large difference between the main and verification experiment may indicate an error or scale effect.</w:t>
+      </w:r>
+    </w:p>
+    <w:p>
+      <w:r>
+        <w:t>Response: We do not dismiss this discrepancy. The revised manuscript states that the verification stack approached 47 °C, whereas the main-trial nominal 50 °C chamber reached only about 25-34 °C in the packages. The difference is treated as consistent with chamber performance, loading, airflow or scale effects, but the available records do not identify a single cause.</w:t>
+      </w:r>
+    </w:p>
+    <w:p>
+      <w:r>
+        <w:t>Changes in Manuscript: Sections 3.2, 3.3 and Limitations revised.</w:t>
       </w:r>
     </w:p>
     <w:p>
       <w:pPr>
-        <w:ind w:left="288"/>
+        <w:pStyle w:val="Heading3"/>
       </w:pPr>
       <w:r>
-        <w:rPr>
-          <w:b/>
-        </w:rPr>
-        <w:t xml:space="preserve">Response: </w:t>
+        <w:t>R3.6 English readability</w:t>
       </w:r>
+    </w:p>
+    <w:p>
       <w:r>
-        <w:t>These questions are fair, and the corrected analysis lets us answer them properly. “Optimisation” has been dropped from the title and the text, since no optimum was determined. On palletisation, the reviewer’s reading was right about stack height and wrong about position — a distinction the earlier version failed to make. Height matters little: 97 cm and 128 cm stacks behave much alike, and we now say plainly that stack height in this range is not a critical variable. Position within the stack matters: referred to each sensor’s own baseline, the bottom units gained 83.8 ± 13.0 mbar against 63.1 ± 8.1 mbar for the top units, a difference of about 21 mbar that is significant (two-way ANOVA, F(1,8) = 9.14; p = 0.017) and reproduced in both chambers. The two heights were compared precisely in order to test whether vertical load matters, and the answer is that it does, through position rather than through height. As for the necessity of pressure monitoring, our own data make the case better than our original text did. Pressure does change during storage — every unit rose by 60–90 mbar and peaked on day 4, then relaxed — and that relaxation occurred while the units were still warming, which rules out simple thermal expansion and points to the flexible film accommodating under sustained load. None of this is visible from outside the pallet. The practical value is that monitoring identifies which units in a load are the most stressed and when, which is the information needed to set stacking limits and packaging specifications. We also report a negative result that we consider useful: the pressure response was statistically indistinguishable between the 19 °C and 50 °C chambers (F(1,8) = 0.21; p = 0.66). Since the chemistry depends on temperature and the mechanics on load, the two have to be managed separately, and the conclusions now say so instead of resting on general statements.</w:t>
+        <w:t>Reviewer Comment: Several sentences are overly complex.</w:t>
+      </w:r>
+    </w:p>
+    <w:p>
+      <w:r>
+        <w:t>Response: The manuscript has been edited throughout for shorter and more precise scientific prose. The Abstract, Introduction, Methods, Results, Limitations and Conclusions were substantially rewritten.</w:t>
+      </w:r>
+    </w:p>
+    <w:p>
+      <w:r>
+        <w:t>Changes in Manuscript: Whole manuscript language edit.</w:t>
       </w:r>
     </w:p>
     <w:sectPr>
       <w:pgSz w:w="12240" w:h="15840"/>
-      <w:pgMar w:top="1440" w:right="1440" w:bottom="1440" w:left="1440" w:header="720" w:footer="720" w:gutter="0"/>
+      <w:pgMar w:top="1440" w:right="1800" w:bottom="1440" w:left="1800" w:header="720" w:footer="720" w:gutter="0"/>
       <w:cols w:space="720"/>
       <w:docGrid w:linePitch="360"/>
     </w:sectPr>
@@ -996,14 +777,6 @@
     <w:name w:val="Normal"/>
     <w:qFormat/>
     <w:rsid w:val="00FC693F"/>
-    <w:pPr>
-      <w:spacing w:after="140"/>
-      <w:jc w:val="both"/>
-    </w:pPr>
-    <w:rPr>
-      <w:rFonts w:ascii="Calibri" w:hAnsi="Calibri"/>
-      <w:sz w:val="21"/>
-    </w:rPr>
   </w:style>
   <w:style w:type="paragraph" w:styleId="Header">
     <w:name w:val="header"/>

</xml_diff>

<commit_message>
Finalize reviewer response package
</commit_message>
<xml_diff>
--- a/Response_to_Reviewers.docx
+++ b/Response_to_Reviewers.docx
@@ -4,7 +4,7 @@
   <w:body>
     <w:p>
       <w:pPr>
-        <w:pStyle w:val="Heading1"/>
+        <w:pStyle w:val="Title"/>
       </w:pPr>
       <w:r>
         <w:t>Response to Reviewers</w:t>
@@ -17,7 +17,15 @@
     </w:p>
     <w:p>
       <w:r>
-        <w:t>We thank Reviewer 2 and Reviewer 3 for the detailed assessment. The revision has been made conservatively. The most important change is that the main trial is no longer described as actual 50 °C wine exposure. We now distinguish chamber set point, nominal chamber condition and measured in-bag temperature throughout the manuscript. We also revised the pressure ANOVA wording as exploratory and sensor-level, and treated lactic acid descriptively because the available revision files contained inconsistent standard deviations and raw chemical replicates were unavailable.</w:t>
+        <w:t>We thank Reviewer 2 and Reviewer 3 for their detailed assessment. After the first revision, additional pressure/temperature workbooks and figures became available in the repository. We therefore re-audited the data provenance, reran the pressure analysis from the main-trial workbook, quantified the first-five-hour sensitivity, reconstructed the verification trial from its workbook, regenerated Figures 3-7 with unambiguous nominal set-point labels, and updated the manuscript and response package accordingly. The new data improve traceability, but they do not add independent chamber replication, stack IDs for the main-trial sensors, raw chemical replicates, microbiology, shelf-life follow-up or cost data.</w:t>
+      </w:r>
+    </w:p>
+    <w:p>
+      <w:pPr>
+        <w:pStyle w:val="Heading1"/>
+      </w:pPr>
+      <w:r>
+        <w:t>Reviewer 2</w:t>
       </w:r>
     </w:p>
     <w:p>
@@ -25,237 +33,7 @@
         <w:pStyle w:val="Heading2"/>
       </w:pPr>
       <w:r>
-        <w:t>Reviewer 2</w:t>
-      </w:r>
-    </w:p>
-    <w:p>
-      <w:pPr>
-        <w:pStyle w:val="Heading3"/>
-      </w:pPr>
-      <w:r>
-        <w:t>R2.1 Main trial did not achieve 50 °C</w:t>
-      </w:r>
-    </w:p>
-    <w:p>
-      <w:r>
-        <w:t>Reviewer Comment: The chamber was set at 50 °C, but the wine experienced about 25-34 °C; this changes the hypothesis test.</w:t>
-      </w:r>
-    </w:p>
-    <w:p>
-      <w:r>
-        <w:t>Response: We agree. The original wording could imply that the wine in the main trial was exposed to 50 °C, which was not the case. The manuscript now states that the 50 °C value was a nominal chamber set point and that measured in-bag temperatures reached about 33.6 ± 1.5 °C in top units and 25.5 ± 0.9 °C in bottom units. The realised study is interpreted as a comparison between nominal chamber conditions and actual package temperatures.</w:t>
-      </w:r>
-    </w:p>
-    <w:p>
-      <w:r>
-        <w:t>Changes in Manuscript: Title, Abstract, Sections 2, 3.1, 3.2, 3.4, Conclusions, captions and Table 2 were revised to use nominal chamber condition and measured in-bag temperature terminology.</w:t>
-      </w:r>
-    </w:p>
-    <w:p>
-      <w:pPr>
-        <w:pStyle w:val="Heading3"/>
-      </w:pPr>
-      <w:r>
-        <w:t>R2.2 Abstract</w:t>
-      </w:r>
-    </w:p>
-    <w:p>
-      <w:r>
-        <w:t>Reviewer Comment: The Abstract should be condensed, restructured and explicit about the actual temperatures.</w:t>
-      </w:r>
-    </w:p>
-    <w:p>
-      <w:r>
-        <w:t>Response: The Abstract has been rewritten. It now reports the actual in-bag temperatures, the pressure effect estimate, the absence of a statistically detectable nominal chamber-condition effect, the scope of the bulk chemistry data and the limited role of the verification trial.</w:t>
-      </w:r>
-    </w:p>
-    <w:p>
-      <w:r>
-        <w:t>Changes in Manuscript: Abstract fully rewritten.</w:t>
-      </w:r>
-    </w:p>
-    <w:p>
-      <w:pPr>
-        <w:pStyle w:val="Heading3"/>
-      </w:pPr>
-      <w:r>
-        <w:t>R2.3 Chamber characteristics</w:t>
-      </w:r>
-    </w:p>
-    <w:p>
-      <w:r>
-        <w:t>Reviewer Comment: Chamber model, air circulation, fan power, chamber volume and pallet occupancy should be provided.</w:t>
-      </w:r>
-    </w:p>
-    <w:p>
-      <w:r>
-        <w:t>Response: We searched the repository and available notes. These details were not recorded in the available experimental record. We have not invented specifications. Instead, we now state that these chamber characteristics are unavailable and that this limits the diagnosis of the thermal lag and vertical gradient observed in the main trial.</w:t>
-      </w:r>
-    </w:p>
-    <w:p>
-      <w:r>
-        <w:t>Changes in Manuscript: Added this limitation in Materials and Methods and Section 3.4.</w:t>
-      </w:r>
-    </w:p>
-    <w:p>
-      <w:pPr>
-        <w:pStyle w:val="Heading3"/>
-      </w:pPr>
-      <w:r>
-        <w:t>R2.4 Small sample size and ANOVA power</w:t>
-      </w:r>
-    </w:p>
-    <w:p>
-      <w:r>
-        <w:t>Reviewer Comment: The pressure ANOVA has very limited power because n is small and one bottom sensor is missing.</w:t>
-      </w:r>
-    </w:p>
-    <w:p>
-      <w:r>
-        <w:t>Response: We agree. The revised manuscript now states the pressure cell sizes (n = 3, 3, 3 and 2), the missing sensor, the unbalanced design and the limited power. We retained the two-way ANOVA because it is the analysis used for the embedded pressure summaries, but interpret it as an exploratory sensor-level analysis and report effect estimates and confidence intervals alongside p-values. Because stack identifiers are not retained in the embedded summary table, the p-values are not presented as definitive stack-level tests.</w:t>
-      </w:r>
-    </w:p>
-    <w:p>
-      <w:r>
-        <w:t>Changes in Manuscript: Sections 2.2, 2.4, 3.2, 3.4 and Conclusions revised. `anova_pressure.py` was updated and `analysis_verification.md` added.</w:t>
-      </w:r>
-    </w:p>
-    <w:p>
-      <w:pPr>
-        <w:pStyle w:val="Heading3"/>
-      </w:pPr>
-      <w:r>
-        <w:t>R2.5 Verification trial n=1 stack</w:t>
-      </w:r>
-    </w:p>
-    <w:p>
-      <w:r>
-        <w:t>Reviewer Comment: The verification trial cannot confirm general conclusions because it used only one stack and one sensor failed.</w:t>
-      </w:r>
-    </w:p>
-    <w:p>
-      <w:r>
-        <w:t>Response: We agree. All confirmatory language has been removed. The verification trial is now described as a limited supporting observation under one three-box-stack configuration. The manuscript explicitly states that it cannot establish a general position effect.</w:t>
-      </w:r>
-    </w:p>
-    <w:p>
-      <w:r>
-        <w:t>Changes in Manuscript: Sections 2.3, 3.3, 3.4 and Conclusions revised.</w:t>
-      </w:r>
-    </w:p>
-    <w:p>
-      <w:pPr>
-        <w:pStyle w:val="Heading3"/>
-      </w:pPr>
-      <w:r>
-        <w:t>R2.6 Physical-vs-chemical binary conclusion</w:t>
-      </w:r>
-    </w:p>
-    <w:p>
-      <w:r>
-        <w:t>Reviewer Comment: The claim that palletisation governs physical behaviour and temperature governs chemical stability is overreaching because chemistry was not position-resolved.</w:t>
-      </w:r>
-    </w:p>
-    <w:p>
-      <w:r>
-        <w:t>Response: We agree. The revised manuscript no longer presents this binary causal attribution. It now states that pressure was position-resolved and showed a transient bottom-position peak, whereas chemistry was measured as bulk wine grouped by nominal chamber condition and cannot be linked directly to stack position.</w:t>
-      </w:r>
-    </w:p>
-    <w:p>
-      <w:r>
-        <w:t>Changes in Manuscript: Abstract, Section 3.2, Limitations and Conclusions revised.</w:t>
-      </w:r>
-    </w:p>
-    <w:p>
-      <w:pPr>
-        <w:pStyle w:val="Heading3"/>
-      </w:pPr>
-      <w:r>
-        <w:t>R2.7 Lactic acid interpretation</w:t>
-      </w:r>
-    </w:p>
-    <w:p>
-      <w:r>
-        <w:t>Reviewer Comment: The lactic-acid increase cannot be confidently attributed to heat-driven chemistry rather than malolactic fermentation without microbiological data.</w:t>
-      </w:r>
-    </w:p>
-    <w:p>
-      <w:r>
-        <w:t>Response: We agree. The manuscript no longer states that malolactic fermentation was ruled out. During revision we also found that the available files contained inconsistent standard deviations for lactic acid in the nominal 50 °C chamber (0.02 versus 0.20 g/L), while the raw chemical replicates were not available. We therefore revised Table 2 conservatively to use 0.29 ± 0.20 g/L, assigned the same significance letter to both lactic-acid means, and now treat lactic acid descriptively rather than as an independently verified significant difference. We retained the observation that malic acid did not decrease significantly, but we now state that no microbiological analyses, viable cell counts or method-sensitivity study were available and that residual microbial activity cannot be excluded.</w:t>
-      </w:r>
-    </w:p>
-    <w:p>
-      <w:r>
-        <w:t>Changes in Manuscript: Sections 2.4 and 3.1, Table 2 and Limitations revised.</w:t>
-      </w:r>
-    </w:p>
-    <w:p>
-      <w:pPr>
-        <w:pStyle w:val="Heading3"/>
-      </w:pPr>
-      <w:r>
-        <w:t>R2.8 Table 2 labels</w:t>
-      </w:r>
-    </w:p>
-    <w:p>
-      <w:r>
-        <w:t>Reviewer Comment: "Wine at 19 °C" and "Wine at 50 °C" are misleading.</w:t>
-      </w:r>
-    </w:p>
-    <w:p>
-      <w:r>
-        <w:t>Response: Corrected. The row labels now read "Wine from nominal 19 °C chamber" and "Wine from nominal 50 °C chamber." The caption and table note clarify that these labels are chamber set points, not actual wine temperatures.</w:t>
-      </w:r>
-    </w:p>
-    <w:p>
-      <w:r>
-        <w:t>Changes in Manuscript: Table 2 labels, caption and note revised.</w:t>
-      </w:r>
-    </w:p>
-    <w:p>
-      <w:pPr>
-        <w:pStyle w:val="Heading3"/>
-      </w:pPr>
-      <w:r>
-        <w:t>R2.9 First five hours excluded</w:t>
-      </w:r>
-    </w:p>
-    <w:p>
-      <w:r>
-        <w:t>Reviewer Comment: The first five hours may represent realistic transport disturbances and should be discussed or tested by sensitivity analysis.</w:t>
-      </w:r>
-    </w:p>
-    <w:p>
-      <w:r>
-        <w:t>Response: We agree that these early transients may be relevant to some logistics scenarios. The revised manuscript explains why the interval was excluded from the primary storage analysis: it contained transport from the filling line, filling/sealing and stack assembly, and was sampled only every 30 minutes. A full-record sensitivity analysis could not be recomputed from the repository because the raw logger export is absent. We now state this limitation explicitly rather than implying that the exclusion is consequence-free.</w:t>
-      </w:r>
-    </w:p>
-    <w:p>
-      <w:r>
-        <w:t>Changes in Manuscript: Section 3.2 and Limitations revised; `analysis_verification.md` documents the missing raw-data constraint.</w:t>
-      </w:r>
-    </w:p>
-    <w:p>
-      <w:pPr>
-        <w:pStyle w:val="Heading3"/>
-      </w:pPr>
-      <w:r>
-        <w:t>R2.10 Wine identity</w:t>
-      </w:r>
-    </w:p>
-    <w:p>
-      <w:r>
-        <w:t>Reviewer Comment: Grape variety and vintage are unknown.</w:t>
-      </w:r>
-    </w:p>
-    <w:p>
-      <w:r>
-        <w:t>Response: Correct. The supplier did not provide grape variety or vintage information. We have retained this statement and list it as a limitation.</w:t>
-      </w:r>
-    </w:p>
-    <w:p>
-      <w:r>
-        <w:t>Changes in Manuscript: Materials and Methods and Limitations revised.</w:t>
+        <w:t>R2.1 Main trial did not achieve 50 degC</w:t>
       </w:r>
     </w:p>
     <w:p>
@@ -263,145 +41,751 @@
         <w:pStyle w:val="Heading2"/>
       </w:pPr>
       <w:r>
+        <w:t>Reviewer Comment</w:t>
+      </w:r>
+    </w:p>
+    <w:p>
+      <w:r>
+        <w:t>The chamber was set at 50 degC, but the wine experienced about 25-34 degC; this changes the hypothesis test.</w:t>
+      </w:r>
+    </w:p>
+    <w:p>
+      <w:pPr>
+        <w:pStyle w:val="Heading2"/>
+      </w:pPr>
+      <w:r>
+        <w:t>Response</w:t>
+      </w:r>
+    </w:p>
+    <w:p>
+      <w:r>
+        <w:t>We agree. The revised manuscript no longer treats the main trial as actual 50 degC wine exposure. The newly available Results.xlsx workbook allowed us to quantify the realised in-bag temperatures directly. During the late storage window (days 19.5-20), the nominal 50 degC chamber averaged 34.18 +/- 0.36 degC in top-position sensors and 26.08 +/- 0.23 degC in bottom-position sensors. The nominal 19 degC chamber averaged 23.50 +/- 0.21 degC in top-position sensors and 22.84 +/- 0.30 degC in bottom-position sensors. The study is therefore interpreted as a comparison between nominal chamber conditions and measured package temperatures, not as a direct 19 degC versus 50 degC wine-temperature comparison.</w:t>
+      </w:r>
+    </w:p>
+    <w:p>
+      <w:pPr>
+        <w:pStyle w:val="Heading2"/>
+      </w:pPr>
+      <w:r>
+        <w:t>Changes in Manuscript</w:t>
+      </w:r>
+    </w:p>
+    <w:p>
+      <w:r>
+        <w:t>The Title, Abstract, Sections 2, 3.1, 3.2, 3.4, Conclusions, captions and Table 2 now distinguish nominal chamber set point from measured in-bag temperature. The highlighted manuscript marks these changes.</w:t>
+      </w:r>
+    </w:p>
+    <w:p>
+      <w:pPr>
+        <w:pStyle w:val="Heading2"/>
+      </w:pPr>
+      <w:r>
+        <w:t>R2.2 Abstract</w:t>
+      </w:r>
+    </w:p>
+    <w:p>
+      <w:pPr>
+        <w:pStyle w:val="Heading2"/>
+      </w:pPr>
+      <w:r>
+        <w:t>Reviewer Comment</w:t>
+      </w:r>
+    </w:p>
+    <w:p>
+      <w:r>
+        <w:t>The Abstract should be condensed, restructured and explicit about the actual temperatures.</w:t>
+      </w:r>
+    </w:p>
+    <w:p>
+      <w:pPr>
+        <w:pStyle w:val="Heading2"/>
+      </w:pPr>
+      <w:r>
+        <w:t>Response</w:t>
+      </w:r>
+    </w:p>
+    <w:p>
+      <w:r>
+        <w:t>The Abstract has been rewritten again after the second-pass data audit. It now reports the raw-workbook late-temperature summaries, the exploratory pressure effect estimate, the absence of a statistically detectable nominal chamber-condition effect, the summary-only scope of the chemistry data, and the limited role of the verification trial.</w:t>
+      </w:r>
+    </w:p>
+    <w:p>
+      <w:pPr>
+        <w:pStyle w:val="Heading2"/>
+      </w:pPr>
+      <w:r>
+        <w:t>Changes in Manuscript</w:t>
+      </w:r>
+    </w:p>
+    <w:p>
+      <w:r>
+        <w:t>The Abstract was replaced with a shorter evidence-aligned version. It no longer states or implies that the main trial exposed wine to 50 degC and no longer describes all pressure peaks as occurring on a single day.</w:t>
+      </w:r>
+    </w:p>
+    <w:p>
+      <w:pPr>
+        <w:pStyle w:val="Heading2"/>
+      </w:pPr>
+      <w:r>
+        <w:t>R2.3 Chamber characteristics</w:t>
+      </w:r>
+    </w:p>
+    <w:p>
+      <w:pPr>
+        <w:pStyle w:val="Heading2"/>
+      </w:pPr>
+      <w:r>
+        <w:t>Reviewer Comment</w:t>
+      </w:r>
+    </w:p>
+    <w:p>
+      <w:r>
+        <w:t>Chamber model, air circulation, fan power, chamber volume and pallet occupancy should be provided.</w:t>
+      </w:r>
+    </w:p>
+    <w:p>
+      <w:pPr>
+        <w:pStyle w:val="Heading2"/>
+      </w:pPr>
+      <w:r>
+        <w:t>Response</w:t>
+      </w:r>
+    </w:p>
+    <w:p>
+      <w:r>
+        <w:t>We searched the original repository files and the newly added workbooks/figures. These chamber-control details were not present. We have not invented specifications. Instead, the manuscript now states that chamber model, chamber volume, fan power, airflow rate and pallet occupancy ratio were not recorded and that this limits diagnosis of the thermal lag and vertical gradient observed in the main trial.</w:t>
+      </w:r>
+    </w:p>
+    <w:p>
+      <w:pPr>
+        <w:pStyle w:val="Heading2"/>
+      </w:pPr>
+      <w:r>
+        <w:t>Changes in Manuscript</w:t>
+      </w:r>
+    </w:p>
+    <w:p>
+      <w:r>
+        <w:t>The Materials and Methods and Limitations sections state which chamber details were unavailable and restrict mechanism language to hypotheses.</w:t>
+      </w:r>
+    </w:p>
+    <w:p>
+      <w:pPr>
+        <w:pStyle w:val="Heading2"/>
+      </w:pPr>
+      <w:r>
+        <w:t>R2.4 Small sample size and ANOVA power</w:t>
+      </w:r>
+    </w:p>
+    <w:p>
+      <w:pPr>
+        <w:pStyle w:val="Heading2"/>
+      </w:pPr>
+      <w:r>
+        <w:t>Reviewer Comment</w:t>
+      </w:r>
+    </w:p>
+    <w:p>
+      <w:r>
+        <w:t>The pressure ANOVA has very limited power because n is small and one bottom sensor is missing.</w:t>
+      </w:r>
+    </w:p>
+    <w:p>
+      <w:pPr>
+        <w:pStyle w:val="Heading2"/>
+      </w:pPr>
+      <w:r>
+        <w:t>Response</w:t>
+      </w:r>
+    </w:p>
+    <w:p>
+      <w:r>
+        <w:t>We agree. The second-pass audit changes the reproducibility status but not the replication status. The newly available Results.xlsx workbook lets us reconstruct the pressure summaries from the main-trial data, and anova_pressure.py --from-raw now reads that workbook. The reconstructed values match the embedded summaries to 0.0000 mbar. However, the pressure cells remain n = 3, 3, 3 and 2, chamber condition remains one chamber per nominal set point, and the workbook does not retain stack IDs or sensor-to-stack pairings for a blocked or paired stack-level analysis. We therefore retain the ANOVA only as exploratory sensor-level inference and report effect estimates and confidence intervals alongside p-values.</w:t>
+      </w:r>
+    </w:p>
+    <w:p>
+      <w:pPr>
+        <w:pStyle w:val="Heading2"/>
+      </w:pPr>
+      <w:r>
+        <w:t>Changes in Manuscript</w:t>
+      </w:r>
+    </w:p>
+    <w:p>
+      <w:r>
+        <w:t>Sections 2.2, 2.4, 3.2, 3.4 and Conclusions now state the experimental unit, the missing sensor, the unbalanced design, the unreplicated chamber factor and the exploratory interpretation. The analysis report and anova_pressure.py were updated to document the raw-workbook reconstruction.</w:t>
+      </w:r>
+    </w:p>
+    <w:p>
+      <w:pPr>
+        <w:pStyle w:val="Heading2"/>
+      </w:pPr>
+      <w:r>
+        <w:t>R2.5 Verification trial n=1 stack</w:t>
+      </w:r>
+    </w:p>
+    <w:p>
+      <w:pPr>
+        <w:pStyle w:val="Heading2"/>
+      </w:pPr>
+      <w:r>
+        <w:t>Reviewer Comment</w:t>
+      </w:r>
+    </w:p>
+    <w:p>
+      <w:r>
+        <w:t>The verification trial cannot confirm general conclusions because it used only one stack and one sensor failed.</w:t>
+      </w:r>
+    </w:p>
+    <w:p>
+      <w:pPr>
+        <w:pStyle w:val="Heading2"/>
+      </w:pPr>
+      <w:r>
+        <w:t>Response</w:t>
+      </w:r>
+    </w:p>
+    <w:p>
+      <w:r>
+        <w:t>We agree. The verification workbook now allows a more precise description, but it does not create replication. The trial used one three-box stack. V26, one top-position sensor, stopped at day 4.35. Across the four verification sensors, maximum in-bag temperatures ranged from 45.0 to 48.8 degC, and no in-bag sensor reached 50 degC. Pressure changes from each sensor's first valid baseline were transient, with peaks of 9.6-26.5 mbar. The manuscript presents this trial as limited supporting evidence under one configuration, not as confirmation of a general position effect.</w:t>
+      </w:r>
+    </w:p>
+    <w:p>
+      <w:pPr>
+        <w:pStyle w:val="Heading2"/>
+      </w:pPr>
+      <w:r>
+        <w:t>Changes in Manuscript</w:t>
+      </w:r>
+    </w:p>
+    <w:p>
+      <w:r>
+        <w:t>Sections 2.3, 3.3, 3.4 and Conclusions were revised to remove confirmatory language and to report the verification trial's scale, V26 dropout and actual sensor maxima.</w:t>
+      </w:r>
+    </w:p>
+    <w:p>
+      <w:pPr>
+        <w:pStyle w:val="Heading2"/>
+      </w:pPr>
+      <w:r>
+        <w:t>R2.6 Physical-versus-chemical binary conclusion</w:t>
+      </w:r>
+    </w:p>
+    <w:p>
+      <w:pPr>
+        <w:pStyle w:val="Heading2"/>
+      </w:pPr>
+      <w:r>
+        <w:t>Reviewer Comment</w:t>
+      </w:r>
+    </w:p>
+    <w:p>
+      <w:r>
+        <w:t>The claim that palletisation governs physical behaviour and temperature governs chemical stability is overreaching because chemistry was not position-resolved.</w:t>
+      </w:r>
+    </w:p>
+    <w:p>
+      <w:pPr>
+        <w:pStyle w:val="Heading2"/>
+      </w:pPr>
+      <w:r>
+        <w:t>Response</w:t>
+      </w:r>
+    </w:p>
+    <w:p>
+      <w:r>
+        <w:t>We agree. The manuscript no longer presents this binary causal attribution. The new data do not add position-resolved chemistry. The final text states that pressure was measured by package position and showed a transient bottom-position peak, whereas chemistry was measured as bulk wine grouped by nominal chamber condition. These two datasets support different descriptive response patterns, but they do not demonstrate that palletisation and temperature act independently or exclusively on separate parts of the system.</w:t>
+      </w:r>
+    </w:p>
+    <w:p>
+      <w:pPr>
+        <w:pStyle w:val="Heading2"/>
+      </w:pPr>
+      <w:r>
+        <w:t>Changes in Manuscript</w:t>
+      </w:r>
+    </w:p>
+    <w:p>
+      <w:r>
+        <w:t>The Abstract, Discussion, Limitations and Conclusions were revised; unsupported "governs" language was removed.</w:t>
+      </w:r>
+    </w:p>
+    <w:p>
+      <w:pPr>
+        <w:pStyle w:val="Heading2"/>
+      </w:pPr>
+      <w:r>
+        <w:t>R2.7 Lactic acid interpretation</w:t>
+      </w:r>
+    </w:p>
+    <w:p>
+      <w:pPr>
+        <w:pStyle w:val="Heading2"/>
+      </w:pPr>
+      <w:r>
+        <w:t>Reviewer Comment</w:t>
+      </w:r>
+    </w:p>
+    <w:p>
+      <w:r>
+        <w:t>The lactic-acid increase cannot be confidently attributed to heat-driven chemistry rather than malolactic fermentation without microbiological data.</w:t>
+      </w:r>
+    </w:p>
+    <w:p>
+      <w:pPr>
+        <w:pStyle w:val="Heading2"/>
+      </w:pPr>
+      <w:r>
+        <w:t>Response</w:t>
+      </w:r>
+    </w:p>
+    <w:p>
+      <w:r>
+        <w:t>We agree. We inspected the newly added Results.xlsx workbook and confirmed that it contains pressure/temperature data only, not raw chemical replicates. The repository therefore still does not resolve the lactic-acid SD inconsistency in the original files or provide microbiological evidence. The manuscript keeps the conservative 0.29 +/- 0.20 g/L value for the nominally warmer chamber and treats lactic acid descriptively. We state that malic acid did not show the clear decrease expected for a simple malolactic-conversion interpretation, but we no longer state that malolactic fermentation was ruled out. Residual microbial activity cannot be excluded.</w:t>
+      </w:r>
+    </w:p>
+    <w:p>
+      <w:pPr>
+        <w:pStyle w:val="Heading2"/>
+      </w:pPr>
+      <w:r>
+        <w:t>Changes in Manuscript</w:t>
+      </w:r>
+    </w:p>
+    <w:p>
+      <w:r>
+        <w:t>Sections 2.4 and 3.1, Table 2 and Limitations were revised to describe lactic acid as a descriptive observation and to state the absence of raw chemical replicates, microbiology, viable cell counts and method-sensitivity data.</w:t>
+      </w:r>
+    </w:p>
+    <w:p>
+      <w:pPr>
+        <w:pStyle w:val="Heading2"/>
+      </w:pPr>
+      <w:r>
+        <w:t>R2.8 Table 2 labels</w:t>
+      </w:r>
+    </w:p>
+    <w:p>
+      <w:pPr>
+        <w:pStyle w:val="Heading2"/>
+      </w:pPr>
+      <w:r>
+        <w:t>Reviewer Comment</w:t>
+      </w:r>
+    </w:p>
+    <w:p>
+      <w:r>
+        <w:t>"Wine at 19 degC" and "Wine at 50 degC" are misleading.</w:t>
+      </w:r>
+    </w:p>
+    <w:p>
+      <w:pPr>
+        <w:pStyle w:val="Heading2"/>
+      </w:pPr>
+      <w:r>
+        <w:t>Response</w:t>
+      </w:r>
+    </w:p>
+    <w:p>
+      <w:r>
+        <w:t>Corrected. Table 2 now labels the rows as wine from the nominal 19 degC chamber and wine from the nominal 50 degC chamber. The caption states that these labels are chamber set points, not actual in-bag wine temperatures.</w:t>
+      </w:r>
+    </w:p>
+    <w:p>
+      <w:pPr>
+        <w:pStyle w:val="Heading2"/>
+      </w:pPr>
+      <w:r>
+        <w:t>Changes in Manuscript</w:t>
+      </w:r>
+    </w:p>
+    <w:p>
+      <w:r>
+        <w:t>Table 2 row labels, caption and note were revised and highlighted.</w:t>
+      </w:r>
+    </w:p>
+    <w:p>
+      <w:pPr>
+        <w:pStyle w:val="Heading2"/>
+      </w:pPr>
+      <w:r>
+        <w:t>R2.9 First five hours excluded</w:t>
+      </w:r>
+    </w:p>
+    <w:p>
+      <w:pPr>
+        <w:pStyle w:val="Heading2"/>
+      </w:pPr>
+      <w:r>
+        <w:t>Reviewer Comment</w:t>
+      </w:r>
+    </w:p>
+    <w:p>
+      <w:r>
+        <w:t>The first five hours may represent realistic transport disturbances and should be discussed or tested by sensitivity analysis.</w:t>
+      </w:r>
+    </w:p>
+    <w:p>
+      <w:pPr>
+        <w:pStyle w:val="Heading2"/>
+      </w:pPr>
+      <w:r>
+        <w:t>Response</w:t>
+      </w:r>
+    </w:p>
+    <w:p>
+      <w:r>
+        <w:t>The newly available Results.xlsx workbook allowed us to perform the sensitivity analysis that was impossible in the first pass. Including the first five hours did not change the primary peak-pressure endpoint: for all 11 usable sensors, the full-record maximum dP was identical to the post-handling maximum used in the primary analysis. The individual maxima occurred after the handling window, between 85.0 and 138.5 h. We still do not treat the first five hours as settled storage exposure because the interval contained transport/handling/stack assembly and the available workbook contains duplicated early rows. The final manuscript therefore keeps the primary post-handling analysis but now reports the full-record sensitivity result and discusses the logistics relevance of early transients.</w:t>
+      </w:r>
+    </w:p>
+    <w:p>
+      <w:pPr>
+        <w:pStyle w:val="Heading2"/>
+      </w:pPr>
+      <w:r>
+        <w:t>Changes in Manuscript</w:t>
+      </w:r>
+    </w:p>
+    <w:p>
+      <w:r>
+        <w:t>Section 3.2 and Limitations now report the sensitivity analysis and no longer say that raw pressure data were absent.</w:t>
+      </w:r>
+    </w:p>
+    <w:p>
+      <w:pPr>
+        <w:pStyle w:val="Heading2"/>
+      </w:pPr>
+      <w:r>
+        <w:t>R2.10 Wine identity</w:t>
+      </w:r>
+    </w:p>
+    <w:p>
+      <w:pPr>
+        <w:pStyle w:val="Heading2"/>
+      </w:pPr>
+      <w:r>
+        <w:t>Reviewer Comment</w:t>
+      </w:r>
+    </w:p>
+    <w:p>
+      <w:r>
+        <w:t>Grape variety and vintage are unknown.</w:t>
+      </w:r>
+    </w:p>
+    <w:p>
+      <w:pPr>
+        <w:pStyle w:val="Heading2"/>
+      </w:pPr>
+      <w:r>
+        <w:t>Response</w:t>
+      </w:r>
+    </w:p>
+    <w:p>
+      <w:r>
+        <w:t>Correct. The new workbooks were also checked and contain no grape variety or vintage metadata. The supplier did not provide this information, and the manuscript retains it as a limitation.</w:t>
+      </w:r>
+    </w:p>
+    <w:p>
+      <w:pPr>
+        <w:pStyle w:val="Heading2"/>
+      </w:pPr>
+      <w:r>
+        <w:t>Changes in Manuscript</w:t>
+      </w:r>
+    </w:p>
+    <w:p>
+      <w:r>
+        <w:t>Materials and Methods and Limitations state that grape variety and vintage were unavailable.</w:t>
+      </w:r>
+    </w:p>
+    <w:p>
+      <w:pPr>
+        <w:pStyle w:val="Heading1"/>
+      </w:pPr>
+      <w:r>
         <w:t>Reviewer 3</w:t>
       </w:r>
     </w:p>
     <w:p>
       <w:pPr>
-        <w:pStyle w:val="Heading3"/>
+        <w:pStyle w:val="Heading2"/>
       </w:pPr>
       <w:r>
         <w:t>R3.1 Stacking configuration and interpretability</w:t>
       </w:r>
     </w:p>
     <w:p>
+      <w:pPr>
+        <w:pStyle w:val="Heading2"/>
+      </w:pPr>
       <w:r>
-        <w:t>Reviewer Comment: It is difficult to evaluate stacking configuration because different configurations and temperatures may be confounded or averaged.</w:t>
+        <w:t>Reviewer Comment</w:t>
       </w:r>
     </w:p>
     <w:p>
       <w:r>
-        <w:t>Response: We appreciate this point. The revised manuscript clarifies that the pressure analysis tested top versus bottom package position under the tested stack configuration. Stack height was not analysed as an independent factor because only one four-box stack and two three-box stacks were present per chamber. We also state that chamber condition is unreplicated at chamber level, and that the pressure ANOVA is an exploratory sensor-level analysis rather than a definitive paired stack-level test.</w:t>
+        <w:t>It is difficult to evaluate stacking configuration because different configurations and temperatures may be confounded or averaged.</w:t>
+      </w:r>
+    </w:p>
+    <w:p>
+      <w:pPr>
+        <w:pStyle w:val="Heading2"/>
+      </w:pPr>
+      <w:r>
+        <w:t>Response</w:t>
       </w:r>
     </w:p>
     <w:p>
       <w:r>
-        <w:t>Changes in Manuscript: Figure 2 caption, Table 1 note, Sections 2.2, 2.4, 3.4 and Conclusions revised.</w:t>
+        <w:t>We appreciate this point. The final manuscript clarifies that the pressure analysis evaluates top versus bottom package position under the tested stack configuration. Stack height was not analysed as an independent factor because the design contained one four-box stack and two three-box stacks per nominal chamber condition. The newly available Results.xlsx workbook restores the main-trial traces but does not restore stack IDs or sensor-to-stack pairings. Chamber condition also remains unreplicated at the chamber level. The pressure ANOVA is therefore presented as exploratory sensor-level analysis rather than a definitive test of stack height, chamber temperature or paired stack effects.</w:t>
       </w:r>
     </w:p>
     <w:p>
       <w:pPr>
-        <w:pStyle w:val="Heading3"/>
+        <w:pStyle w:val="Heading2"/>
       </w:pPr>
       <w:r>
-        <w:t>R3.2 SO₂ reduction and post-transport shelf life</w:t>
+        <w:t>Changes in Manuscript</w:t>
       </w:r>
     </w:p>
     <w:p>
       <w:r>
-        <w:t>Reviewer Comment: Could SO₂ loss affect shelf life and storage after transport?</w:t>
+        <w:t>Figure 2 caption, Table 1 note, Sections 2.2, 2.4, 3.4 and Conclusions were revised to define the tested factors and inference limits.</w:t>
+      </w:r>
+    </w:p>
+    <w:p>
+      <w:pPr>
+        <w:pStyle w:val="Heading2"/>
+      </w:pPr>
+      <w:r>
+        <w:t>R3.2 SO2 reduction and post-transport shelf life</w:t>
+      </w:r>
+    </w:p>
+    <w:p>
+      <w:pPr>
+        <w:pStyle w:val="Heading2"/>
+      </w:pPr>
+      <w:r>
+        <w:t>Reviewer Comment</w:t>
       </w:r>
     </w:p>
     <w:p>
       <w:r>
-        <w:t>Response: We now discuss this conservatively. The wine from the nominally warmer chamber had lower total and free SO₂ values after 20 days than the reference-chamber wine. This may indicate a lower antioxidant and antimicrobial reserve available after transport, but actual shelf life, sensory quality and microbial stability after transport were not measured. We therefore present post-transport storage impact as a potential implication, not a measured outcome.</w:t>
+        <w:t>Could SO2 loss affect shelf life and storage after transport?</w:t>
+      </w:r>
+    </w:p>
+    <w:p>
+      <w:pPr>
+        <w:pStyle w:val="Heading2"/>
+      </w:pPr>
+      <w:r>
+        <w:t>Response</w:t>
       </w:r>
     </w:p>
     <w:p>
       <w:r>
-        <w:t>Changes in Manuscript: Section 3.1, Limitations and Conclusions revised.</w:t>
+        <w:t>We discuss this conservatively. The final manuscript reports that wine from the nominally warmer chamber had lower total and free SO2 values after 20 days than the reference-chamber wine. This may indicate a lower antioxidant and antimicrobial reserve after transport, but actual post-transport shelf life, sensory quality and microbial stability were not measured. We therefore present shelf-life impact as a potential implication, not a measured outcome.</w:t>
       </w:r>
     </w:p>
     <w:p>
       <w:pPr>
-        <w:pStyle w:val="Heading3"/>
+        <w:pStyle w:val="Heading2"/>
+      </w:pPr>
+      <w:r>
+        <w:t>Changes in Manuscript</w:t>
+      </w:r>
+    </w:p>
+    <w:p>
+      <w:r>
+        <w:t>Section 3.1, Limitations and Conclusions were revised.</w:t>
+      </w:r>
+    </w:p>
+    <w:p>
+      <w:pPr>
+        <w:pStyle w:val="Heading2"/>
       </w:pPr>
       <w:r>
         <w:t>R3.3 Economic feasibility of pressure sensors</w:t>
       </w:r>
     </w:p>
     <w:p>
+      <w:pPr>
+        <w:pStyle w:val="Heading2"/>
+      </w:pPr>
       <w:r>
-        <w:t>Reviewer Comment: The feasibility of using pressure sensors at scale is unclear.</w:t>
+        <w:t>Reviewer Comment</w:t>
       </w:r>
     </w:p>
     <w:p>
       <w:r>
-        <w:t>Response: We agree that the original recommendation was too broad. The revised manuscript does not recommend instrumenting every commercial BiB. It now frames sensor use as selected sentinel packages, validation deployments or quality-control monitoring. We also state that no techno-economic analysis was performed.</w:t>
+        <w:t>The feasibility of using pressure sensors at scale is unclear.</w:t>
+      </w:r>
+    </w:p>
+    <w:p>
+      <w:pPr>
+        <w:pStyle w:val="Heading2"/>
+      </w:pPr>
+      <w:r>
+        <w:t>Response</w:t>
       </w:r>
     </w:p>
     <w:p>
       <w:r>
-        <w:t>Changes in Manuscript: Limitations and Conclusions revised.</w:t>
+        <w:t>We agree. The manuscript no longer recommends instrumenting every commercial BiB. It frames sensor use as selected sentinel packages, validation campaigns and quality-control deployments. We also state that no techno-economic analysis or deployment-density study was performed.</w:t>
       </w:r>
     </w:p>
     <w:p>
       <w:pPr>
-        <w:pStyle w:val="Heading3"/>
+        <w:pStyle w:val="Heading2"/>
       </w:pPr>
       <w:r>
-        <w:t>R3.4 Thermal behaviour under nominal 19 °C and 50 °C conditions</w:t>
+        <w:t>Changes in Manuscript</w:t>
       </w:r>
     </w:p>
     <w:p>
       <w:r>
-        <w:t>Reviewer Comment: The nominal 50 °C packages stayed below set point, whereas the nominal 19 °C packages reached about 23 °C; this different behaviour needs explanation.</w:t>
+        <w:t>Limitations and Conclusions were revised.</w:t>
+      </w:r>
+    </w:p>
+    <w:p>
+      <w:pPr>
+        <w:pStyle w:val="Heading2"/>
+      </w:pPr>
+      <w:r>
+        <w:t>R3.4 Thermal behaviour under nominal 19 degC and nominal 50 degC conditions</w:t>
+      </w:r>
+    </w:p>
+    <w:p>
+      <w:pPr>
+        <w:pStyle w:val="Heading2"/>
+      </w:pPr>
+      <w:r>
+        <w:t>Reviewer Comment</w:t>
       </w:r>
     </w:p>
     <w:p>
       <w:r>
-        <w:t>Response: We now quantify both observations and distinguish facts from hypotheses. The manuscript states that the nominal 19 °C packages stabilised around 23 °C and the nominal 50 °C packages stabilised at about 34 °C top and 26 °C bottom. Thermal inertia, chamber loading, limited heat transfer and airflow constraints are described as plausible explanations only, because chamber specifications and airflow data were not recorded.</w:t>
+        <w:t>The nominal 50 degC packages stayed below set point, whereas nominal 19 degC packages reached about 23 degC; this different behaviour needs explanation.</w:t>
+      </w:r>
+    </w:p>
+    <w:p>
+      <w:pPr>
+        <w:pStyle w:val="Heading2"/>
+      </w:pPr>
+      <w:r>
+        <w:t>Response</w:t>
       </w:r>
     </w:p>
     <w:p>
       <w:r>
-        <w:t>Changes in Manuscript: Sections 3.2, 3.3 and Limitations revised.</w:t>
+        <w:t>The newly available Results.xlsx workbook lets us answer this quantitatively. Late in the main trial, nominal 50 degC packages averaged 34.18 +/- 0.36 degC at top sensors and 26.08 +/- 0.23 degC at bottom sensors; nominal 19 degC packages averaged 23.50 +/- 0.21 degC at top sensors and 22.84 +/- 0.30 degC at bottom sensors. The manuscript now separates observed facts from interpretation. The observations are consistent with thermal inertia, chamber loading, heat-transfer resistance through the pallet/stack and airflow constraints, but the chamber model, airflow and occupancy data were not recorded, so these remain hypotheses rather than established causes.</w:t>
       </w:r>
     </w:p>
     <w:p>
       <w:pPr>
-        <w:pStyle w:val="Heading3"/>
+        <w:pStyle w:val="Heading2"/>
+      </w:pPr>
+      <w:r>
+        <w:t>Changes in Manuscript</w:t>
+      </w:r>
+    </w:p>
+    <w:p>
+      <w:r>
+        <w:t>Sections 3.2, 3.3, 3.4 and the captions to Figures 3 and 6 were revised with the quantified temperatures and cautious interpretation.</w:t>
+      </w:r>
+    </w:p>
+    <w:p>
+      <w:pPr>
+        <w:pStyle w:val="Heading2"/>
       </w:pPr>
       <w:r>
         <w:t>R3.5 Main experiment versus verification experiment discrepancy</w:t>
       </w:r>
     </w:p>
     <w:p>
+      <w:pPr>
+        <w:pStyle w:val="Heading2"/>
+      </w:pPr>
       <w:r>
-        <w:t>Reviewer Comment: The large difference between the main and verification experiment may indicate an error or scale effect.</w:t>
+        <w:t>Reviewer Comment</w:t>
       </w:r>
     </w:p>
     <w:p>
       <w:r>
-        <w:t>Response: We do not dismiss this discrepancy. The revised manuscript states that the verification stack approached 47 °C, whereas the main-trial nominal 50 °C chamber reached only about 25-34 °C in the packages. The difference is treated as consistent with chamber performance, loading, airflow or scale effects, but the available records do not identify a single cause.</w:t>
+        <w:t>The large difference between the main and verification experiment may indicate an error or scale effect.</w:t>
+      </w:r>
+    </w:p>
+    <w:p>
+      <w:pPr>
+        <w:pStyle w:val="Heading2"/>
+      </w:pPr>
+      <w:r>
+        <w:t>Response</w:t>
       </w:r>
     </w:p>
     <w:p>
       <w:r>
-        <w:t>Changes in Manuscript: Sections 3.2, 3.3 and Limitations revised.</w:t>
+        <w:t>We do not dismiss the discrepancy. The verification workbook shows that the single three-box stack reached much warmer in-bag temperatures than the main nominal 50 degC trial, although no verification sensor reached 50 degC. Sensor maxima were 48.8 degC (V26 top, before dropout), 47.7 degC (V62 top), 45.0 degC (V27 bottom) and 47.6 degC (V64 bottom). Compared with the main trial late means, the verification trial was about 13.4 degC warmer at the top and about 20.2 degC warmer at the bottom. The final manuscript states that the discrepancy may reflect scale, chamber loading, stack geometry, airflow, chamber performance or sensor-location differences, but the available records do not identify a single cause. We therefore do not use the verification trial to correct or override the main trial; it is treated as a separate limited observation.</w:t>
       </w:r>
     </w:p>
     <w:p>
       <w:pPr>
-        <w:pStyle w:val="Heading3"/>
+        <w:pStyle w:val="Heading2"/>
+      </w:pPr>
+      <w:r>
+        <w:t>Changes in Manuscript</w:t>
+      </w:r>
+    </w:p>
+    <w:p>
+      <w:r>
+        <w:t>Sections 3.3 and 3.4, Figure 6 caption, Figure 7 caption and Conclusions were revised to quantify the discrepancy and avoid unsupported causal attribution.</w:t>
+      </w:r>
+    </w:p>
+    <w:p>
+      <w:pPr>
+        <w:pStyle w:val="Heading2"/>
       </w:pPr>
       <w:r>
         <w:t>R3.6 English readability</w:t>
       </w:r>
     </w:p>
     <w:p>
+      <w:pPr>
+        <w:pStyle w:val="Heading2"/>
+      </w:pPr>
       <w:r>
-        <w:t>Reviewer Comment: Several sentences are overly complex.</w:t>
+        <w:t>Reviewer Comment</w:t>
       </w:r>
     </w:p>
     <w:p>
       <w:r>
-        <w:t>Response: The manuscript has been edited throughout for shorter and more precise scientific prose. The Abstract, Introduction, Methods, Results, Limitations and Conclusions were substantially rewritten.</w:t>
+        <w:t>Several sentences are overly complex.</w:t>
+      </w:r>
+    </w:p>
+    <w:p>
+      <w:pPr>
+        <w:pStyle w:val="Heading2"/>
+      </w:pPr>
+      <w:r>
+        <w:t>Response</w:t>
       </w:r>
     </w:p>
     <w:p>
       <w:r>
-        <w:t>Changes in Manuscript: Whole manuscript language edit.</w:t>
+        <w:t>The manuscript was edited throughout in the first revision and then edited again after the second-pass data audit. The final version uses shorter sentences and consistent terminology for nominal set point, nominal chamber condition and measured in-bag temperature.</w:t>
+      </w:r>
+    </w:p>
+    <w:p>
+      <w:pPr>
+        <w:pStyle w:val="Heading2"/>
+      </w:pPr>
+      <w:r>
+        <w:t>Changes in Manuscript</w:t>
+      </w:r>
+    </w:p>
+    <w:p>
+      <w:r>
+        <w:t>The Abstract, Methods, Results, figure/table captions, Limitations and Conclusions were substantially revised and highlighted where changes were reviewer-driven.</w:t>
       </w:r>
     </w:p>
     <w:sectPr>
@@ -777,6 +1161,10 @@
     <w:name w:val="Normal"/>
     <w:qFormat/>
     <w:rsid w:val="00FC693F"/>
+    <w:rPr>
+      <w:rFonts w:ascii="Arial" w:hAnsi="Arial"/>
+      <w:sz w:val="20"/>
+    </w:rPr>
   </w:style>
   <w:style w:type="paragraph" w:styleId="Header">
     <w:name w:val="header"/>

</xml_diff>

<commit_message>
Resolve final lactic and baseline audit
</commit_message>
<xml_diff>
--- a/Response_to_Reviewers.docx
+++ b/Response_to_Reviewers.docx
@@ -341,7 +341,7 @@
     </w:p>
     <w:p>
       <w:r>
-        <w:t>We agree. We inspected the newly added Results.xlsx workbook and confirmed that it contains pressure/temperature data only, not raw chemical replicates. The repository therefore still does not resolve the lactic-acid SD inconsistency in the original files or provide microbiological evidence. The manuscript keeps the conservative 0.29 +/- 0.20 g/L value for the nominally warmer chamber and treats lactic acid descriptively. We state that malic acid did not show the clear decrease expected for a simple malolactic-conversion interpretation, but we no longer state that malolactic fermentation was ruled out. Residual microbial activity cannot be excluded.</w:t>
+        <w:t>We agree. We inspected the newly added Results.xlsx workbook and confirmed that it contains pressure/temperature data only, not raw chemical replicates. A final repository-wide audit traced 0.29 +/- 0.02 g/L to the originally submitted Table 2, whereas the alternative 0.29 +/- 0.20 g/L appears only in later revision/note material and could not be traced to raw chemical replicates or another primary experimental record. The manuscript therefore reports 0.29 +/- 0.02 g/L as the traceable descriptive Table 2 value, without a significance claim. We state that malic acid did not show the clear decrease expected for a simple malolactic-conversion interpretation, but we no longer state that malolactic fermentation was ruled out. Residual microbial activity cannot be excluded.</w:t>
       </w:r>
     </w:p>
     <w:p>
@@ -354,7 +354,7 @@
     </w:p>
     <w:p>
       <w:r>
-        <w:t>Sections 2.4 and 3.1, Table 2 and Limitations were revised to describe lactic acid as a descriptive observation and to state the absence of raw chemical replicates, microbiology, viable cell counts and method-sensitivity data.</w:t>
+        <w:t>Sections 2.4 and 3.1, Table 2 and Limitations were revised to report lactic acid descriptively using the traceable 0.29 +/- 0.02 g/L value and to state the absence of raw chemical replicates, microbiology, viable cell counts and method-sensitivity data.</w:t>
       </w:r>
     </w:p>
     <w:p>

</xml_diff>

<commit_message>
Correct response data provenance framing
</commit_message>
<xml_diff>
--- a/Response_to_Reviewers.docx
+++ b/Response_to_Reviewers.docx
@@ -5,6 +5,7 @@
     <w:p>
       <w:pPr>
         <w:pStyle w:val="Title"/>
+        <w:jc w:val="center"/>
       </w:pPr>
       <w:r>
         <w:t>Response to Reviewers</w:t>
@@ -12,12 +13,18 @@
     </w:p>
     <w:p>
       <w:r>
-        <w:t>Manuscript: "Palletisation and In-Bag Thermal Exposure in Bag-in-Box Wine Packaging under Simulated Export Conditions"</w:t>
+        <w:rPr>
+          <w:b/>
+        </w:rPr>
+        <w:t>Manuscript:</w:t>
+      </w:r>
+      <w:r>
+        <w:t xml:space="preserve"> "Palletisation and In-Bag Thermal Exposure in Bag-in-Box Wine Packaging under Simulated Export Conditions"</w:t>
       </w:r>
     </w:p>
     <w:p>
       <w:r>
-        <w:t>We thank Reviewer 2 and Reviewer 3 for their detailed assessment. After the first revision, additional pressure/temperature workbooks and figures became available in the repository. We therefore re-audited the data provenance, reran the pressure analysis from the main-trial workbook, quantified the first-five-hour sensitivity, reconstructed the verification trial from its workbook, regenerated Figures 3-7 with unambiguous nominal set-point labels, and updated the manuscript and response package accordingly. The new data improve traceability, but they do not add independent chamber replication, stack IDs for the main-trial sensors, raw chemical replicates, microbiology, shelf-life follow-up or cost data.</w:t>
+        <w:t>We thank Reviewer 2 and Reviewer 3 for their detailed assessment. In response to their comments, we undertook a comprehensive re-examination of the original experimental records and revised the manuscript accordingly. This included re-analysis of the main-trial pressure and temperature time-series, a sensitivity analysis of the initial handling period, a more detailed examination of the verification trial, and revision of Figures 3-7 to ensure that nominal chamber set points are clearly distinguished from measured in-bag temperatures. These analyses improve the transparency and traceability of the reported results but do not alter the underlying experimental design or its limitations.</w:t>
       </w:r>
     </w:p>
     <w:p>
@@ -45,7 +52,13 @@
       </w:r>
     </w:p>
     <w:p>
+      <w:pPr>
+        <w:ind w:left="360"/>
+      </w:pPr>
       <w:r>
+        <w:rPr>
+          <w:i/>
+        </w:rPr>
         <w:t>The chamber was set at 50 degC, but the wine experienced about 25-34 degC; this changes the hypothesis test.</w:t>
       </w:r>
     </w:p>
@@ -59,7 +72,7 @@
     </w:p>
     <w:p>
       <w:r>
-        <w:t>We agree. The revised manuscript no longer treats the main trial as actual 50 degC wine exposure. The newly available Results.xlsx workbook allowed us to quantify the realised in-bag temperatures directly. During the late storage window (days 19.5-20), the nominal 50 degC chamber averaged 34.18 +/- 0.36 degC in top-position sensors and 26.08 +/- 0.23 degC in bottom-position sensors. The nominal 19 degC chamber averaged 23.50 +/- 0.21 degC in top-position sensors and 22.84 +/- 0.30 degC in bottom-position sensors. The study is therefore interpreted as a comparison between nominal chamber conditions and measured package temperatures, not as a direct 19 degC versus 50 degC wine-temperature comparison.</w:t>
+        <w:t>We agree. The revised manuscript no longer treats the main trial as actual 50 degC wine exposure. In response to this comment, we re-examined the original main-trial pressure and temperature records and quantified the realised in-bag temperatures directly. During the late storage window (days 19.5-20), the nominal 50 degC chamber averaged 34.18 +/- 0.36 degC in top-position sensors and 26.08 +/- 0.23 degC in bottom-position sensors. The nominal 19 degC chamber averaged 23.50 +/- 0.21 degC in top-position sensors and 22.84 +/- 0.30 degC in bottom-position sensors. The study is therefore interpreted as a comparison between nominal chamber conditions and measured package temperatures, not as a direct 19 degC versus 50 degC wine-temperature comparison.</w:t>
       </w:r>
     </w:p>
     <w:p>
@@ -92,7 +105,13 @@
       </w:r>
     </w:p>
     <w:p>
+      <w:pPr>
+        <w:ind w:left="360"/>
+      </w:pPr>
       <w:r>
+        <w:rPr>
+          <w:i/>
+        </w:rPr>
         <w:t>The Abstract should be condensed, restructured and explicit about the actual temperatures.</w:t>
       </w:r>
     </w:p>
@@ -106,7 +125,7 @@
     </w:p>
     <w:p>
       <w:r>
-        <w:t>The Abstract has been rewritten again after the second-pass data audit. It now reports the raw-workbook late-temperature summaries, the exploratory pressure effect estimate, the absence of a statistically detectable nominal chamber-condition effect, the summary-only scope of the chemistry data, and the limited role of the verification trial.</w:t>
+        <w:t>The Abstract has been revised to reflect the re-analysis of the original experimental records. It now reports the late-temperature summaries, the exploratory pressure effect estimate, the absence of a statistically detectable nominal chamber-condition effect, the summary-only scope of the chemistry data, and the limited role of the verification trial.</w:t>
       </w:r>
     </w:p>
     <w:p>
@@ -139,7 +158,13 @@
       </w:r>
     </w:p>
     <w:p>
+      <w:pPr>
+        <w:ind w:left="360"/>
+      </w:pPr>
       <w:r>
+        <w:rPr>
+          <w:i/>
+        </w:rPr>
         <w:t>Chamber model, air circulation, fan power, chamber volume and pallet occupancy should be provided.</w:t>
       </w:r>
     </w:p>
@@ -153,7 +178,7 @@
     </w:p>
     <w:p>
       <w:r>
-        <w:t>We searched the original repository files and the newly added workbooks/figures. These chamber-control details were not present. We have not invented specifications. Instead, the manuscript now states that chamber model, chamber volume, fan power, airflow rate and pallet occupancy ratio were not recorded and that this limits diagnosis of the thermal lag and vertical gradient observed in the main trial.</w:t>
+        <w:t>We re-examined the original study records and available chamber documentation. These chamber-control details were not present. We have not invented specifications. Instead, the manuscript now states that chamber model, chamber volume, fan power, airflow rate and pallet occupancy ratio were not recorded and that this limits diagnosis of the thermal lag and vertical gradient observed in the main trial.</w:t>
       </w:r>
     </w:p>
     <w:p>
@@ -186,7 +211,13 @@
       </w:r>
     </w:p>
     <w:p>
+      <w:pPr>
+        <w:ind w:left="360"/>
+      </w:pPr>
       <w:r>
+        <w:rPr>
+          <w:i/>
+        </w:rPr>
         <w:t>The pressure ANOVA has very limited power because n is small and one bottom sensor is missing.</w:t>
       </w:r>
     </w:p>
@@ -200,7 +231,7 @@
     </w:p>
     <w:p>
       <w:r>
-        <w:t>We agree. The second-pass audit changes the reproducibility status but not the replication status. The newly available Results.xlsx workbook lets us reconstruct the pressure summaries from the main-trial data, and anova_pressure.py --from-raw now reads that workbook. The reconstructed values match the embedded summaries to 0.0000 mbar. However, the pressure cells remain n = 3, 3, 3 and 2, chamber condition remains one chamber per nominal set point, and the workbook does not retain stack IDs or sensor-to-stack pairings for a blocked or paired stack-level analysis. We therefore retain the ANOVA only as exploratory sensor-level inference and report effect estimates and confidence intervals alongside p-values.</w:t>
+        <w:t>We agree. The re-analysis improves reproducibility but does not change the replication status. We reanalysed the original main-trial sensor records and independently reconstructed the pressure summaries used in the statistical analysis. The reconstructed values match the reported summaries to 0.0000 mbar. However, the pressure cells remain n = 3, 3, 3 and 2, chamber condition remains one chamber per nominal set point, and the records do not retain stack IDs or sensor-to-stack pairings for a blocked or paired stack-level analysis. We therefore retain the ANOVA only as exploratory sensor-level inference and report effect estimates and confidence intervals alongside p-values.</w:t>
       </w:r>
     </w:p>
     <w:p>
@@ -233,7 +264,13 @@
       </w:r>
     </w:p>
     <w:p>
+      <w:pPr>
+        <w:ind w:left="360"/>
+      </w:pPr>
       <w:r>
+        <w:rPr>
+          <w:i/>
+        </w:rPr>
         <w:t>The verification trial cannot confirm general conclusions because it used only one stack and one sensor failed.</w:t>
       </w:r>
     </w:p>
@@ -247,7 +284,7 @@
     </w:p>
     <w:p>
       <w:r>
-        <w:t>We agree. The verification workbook now allows a more precise description, but it does not create replication. The trial used one three-box stack. V26, one top-position sensor, stopped at day 4.35. Across the four verification sensors, maximum in-bag temperatures ranged from 45.0 to 48.8 degC, and no in-bag sensor reached 50 degC. Pressure changes from each sensor's first valid baseline were transient, with peaks of 9.6-26.5 mbar. The manuscript presents this trial as limited supporting evidence under one configuration, not as confirmation of a general position effect.</w:t>
+        <w:t>We agree. We re-examined the original verification-trial records in greater detail, but this does not create replication. The trial used one three-box stack. V26, one top-position sensor, stopped at day 4.35. Across the four verification sensors, maximum in-bag temperatures ranged from 45.0 to 48.8 degC, and no in-bag sensor reached 50 degC. Pressure changes from each sensor's first valid baseline were transient, with peaks of 9.6-26.5 mbar. The manuscript presents this trial as limited supporting evidence under one configuration, not as confirmation of a general position effect.</w:t>
       </w:r>
     </w:p>
     <w:p>
@@ -280,7 +317,13 @@
       </w:r>
     </w:p>
     <w:p>
+      <w:pPr>
+        <w:ind w:left="360"/>
+      </w:pPr>
       <w:r>
+        <w:rPr>
+          <w:i/>
+        </w:rPr>
         <w:t>The claim that palletisation governs physical behaviour and temperature governs chemical stability is overreaching because chemistry was not position-resolved.</w:t>
       </w:r>
     </w:p>
@@ -294,7 +337,7 @@
     </w:p>
     <w:p>
       <w:r>
-        <w:t>We agree. The manuscript no longer presents this binary causal attribution. The new data do not add position-resolved chemistry. The final text states that pressure was measured by package position and showed a transient bottom-position peak, whereas chemistry was measured as bulk wine grouped by nominal chamber condition. These two datasets support different descriptive response patterns, but they do not demonstrate that palletisation and temperature act independently or exclusively on separate parts of the system.</w:t>
+        <w:t>We agree. The manuscript no longer presents this binary causal attribution. The original study records do not contain position-resolved chemistry. The final text states that pressure was measured by package position and showed a transient bottom-position peak, whereas chemistry was measured as bulk wine grouped by nominal chamber condition. These two datasets support different descriptive response patterns, but they do not demonstrate that palletisation and temperature act independently or exclusively on separate parts of the system.</w:t>
       </w:r>
     </w:p>
     <w:p>
@@ -327,7 +370,13 @@
       </w:r>
     </w:p>
     <w:p>
+      <w:pPr>
+        <w:ind w:left="360"/>
+      </w:pPr>
       <w:r>
+        <w:rPr>
+          <w:i/>
+        </w:rPr>
         <w:t>The lactic-acid increase cannot be confidently attributed to heat-driven chemistry rather than malolactic fermentation without microbiological data.</w:t>
       </w:r>
     </w:p>
@@ -341,7 +390,7 @@
     </w:p>
     <w:p>
       <w:r>
-        <w:t>We agree. We inspected the newly added Results.xlsx workbook and confirmed that it contains pressure/temperature data only, not raw chemical replicates. A final repository-wide audit traced 0.29 +/- 0.02 g/L to the originally submitted Table 2, whereas the alternative 0.29 +/- 0.20 g/L appears only in later revision/note material and could not be traced to raw chemical replicates or another primary experimental record. The manuscript therefore reports 0.29 +/- 0.02 g/L as the traceable descriptive Table 2 value, without a significance claim. We state that malic acid did not show the clear decrease expected for a simple malolactic-conversion interpretation, but we no longer state that malolactic fermentation was ruled out. Residual microbial activity cannot be excluded.</w:t>
+        <w:t>We agree. We re-examined the available original experimental records and confirmed that raw replicate-level chemical measurements were not retained in the available study records. The originally submitted Table 2 reports 0.29 +/- 0.02 g/L, whereas no primary experimental record supports the alternative 0.29 +/- 0.20 g/L. The manuscript therefore reports 0.29 +/- 0.02 g/L as the traceable descriptive Table 2 value, without a significance claim. We state that malic acid did not show the clear decrease expected for a simple malolactic-conversion interpretation, but we no longer state that malolactic fermentation was ruled out. Residual microbial activity cannot be excluded.</w:t>
       </w:r>
     </w:p>
     <w:p>
@@ -374,7 +423,13 @@
       </w:r>
     </w:p>
     <w:p>
+      <w:pPr>
+        <w:ind w:left="360"/>
+      </w:pPr>
       <w:r>
+        <w:rPr>
+          <w:i/>
+        </w:rPr>
         <w:t>"Wine at 19 degC" and "Wine at 50 degC" are misleading.</w:t>
       </w:r>
     </w:p>
@@ -421,7 +476,13 @@
       </w:r>
     </w:p>
     <w:p>
+      <w:pPr>
+        <w:ind w:left="360"/>
+      </w:pPr>
       <w:r>
+        <w:rPr>
+          <w:i/>
+        </w:rPr>
         <w:t>The first five hours may represent realistic transport disturbances and should be discussed or tested by sensitivity analysis.</w:t>
       </w:r>
     </w:p>
@@ -435,7 +496,7 @@
     </w:p>
     <w:p>
       <w:r>
-        <w:t>The newly available Results.xlsx workbook allowed us to perform the sensitivity analysis that was impossible in the first pass. Including the first five hours did not change the primary peak-pressure endpoint: for all 11 usable sensors, the full-record maximum dP was identical to the post-handling maximum used in the primary analysis. The individual maxima occurred after the handling window, between 85.0 and 138.5 h. We still do not treat the first five hours as settled storage exposure because the interval contained transport/handling/stack assembly and the available workbook contains duplicated early rows. The final manuscript therefore keeps the primary post-handling analysis but now reports the full-record sensitivity result and discusses the logistics relevance of early transients.</w:t>
+        <w:t>In response to the reviewer, we performed an additional sensitivity analysis using the original main-trial pressure records. Including the first five hours did not change the primary peak-pressure endpoint: for all 11 usable sensors, the full-record maximum dP was identical to the post-handling maximum used in the primary analysis. The individual maxima occurred after the handling window, between 85.0 and 138.5 h. We still do not treat the first five hours as settled storage exposure because the interval contained transport/handling/stack assembly and the available records contain duplicated early rows. The final manuscript therefore keeps the primary post-handling analysis but now reports the full-record sensitivity result and discusses the logistics relevance of early transients.</w:t>
       </w:r>
     </w:p>
     <w:p>
@@ -468,7 +529,13 @@
       </w:r>
     </w:p>
     <w:p>
+      <w:pPr>
+        <w:ind w:left="360"/>
+      </w:pPr>
       <w:r>
+        <w:rPr>
+          <w:i/>
+        </w:rPr>
         <w:t>Grape variety and vintage are unknown.</w:t>
       </w:r>
     </w:p>
@@ -482,7 +549,7 @@
     </w:p>
     <w:p>
       <w:r>
-        <w:t>Correct. The new workbooks were also checked and contain no grape variety or vintage metadata. The supplier did not provide this information, and the manuscript retains it as a limitation.</w:t>
+        <w:t>Correct. We re-examined the original study records and found no information on grape variety or vintage. The supplier did not provide this information, and the manuscript retains it as a limitation.</w:t>
       </w:r>
     </w:p>
     <w:p>
@@ -523,7 +590,13 @@
       </w:r>
     </w:p>
     <w:p>
+      <w:pPr>
+        <w:ind w:left="360"/>
+      </w:pPr>
       <w:r>
+        <w:rPr>
+          <w:i/>
+        </w:rPr>
         <w:t>It is difficult to evaluate stacking configuration because different configurations and temperatures may be confounded or averaged.</w:t>
       </w:r>
     </w:p>
@@ -537,7 +610,7 @@
     </w:p>
     <w:p>
       <w:r>
-        <w:t>We appreciate this point. The final manuscript clarifies that the pressure analysis evaluates top versus bottom package position under the tested stack configuration. Stack height was not analysed as an independent factor because the design contained one four-box stack and two three-box stacks per nominal chamber condition. The newly available Results.xlsx workbook restores the main-trial traces but does not restore stack IDs or sensor-to-stack pairings. Chamber condition also remains unreplicated at the chamber level. The pressure ANOVA is therefore presented as exploratory sensor-level analysis rather than a definitive test of stack height, chamber temperature or paired stack effects.</w:t>
+        <w:t>We appreciate this point. The final manuscript clarifies that the pressure analysis evaluates top versus bottom package position under the tested stack configuration. Stack height was not analysed as an independent factor because the design contained one four-box stack and two three-box stacks per nominal chamber condition. Re-examination of the original main-trial records confirmed the available sensor traces and position/chamber mapping; however, stack identifiers or sensor-to-stack pairings were not retained. Chamber condition also remains unreplicated at the chamber level. The pressure ANOVA is therefore presented as exploratory sensor-level analysis rather than a definitive test of stack height, chamber temperature or paired stack effects.</w:t>
       </w:r>
     </w:p>
     <w:p>
@@ -570,7 +643,13 @@
       </w:r>
     </w:p>
     <w:p>
+      <w:pPr>
+        <w:ind w:left="360"/>
+      </w:pPr>
       <w:r>
+        <w:rPr>
+          <w:i/>
+        </w:rPr>
         <w:t>Could SO2 loss affect shelf life and storage after transport?</w:t>
       </w:r>
     </w:p>
@@ -617,7 +696,13 @@
       </w:r>
     </w:p>
     <w:p>
+      <w:pPr>
+        <w:ind w:left="360"/>
+      </w:pPr>
       <w:r>
+        <w:rPr>
+          <w:i/>
+        </w:rPr>
         <w:t>The feasibility of using pressure sensors at scale is unclear.</w:t>
       </w:r>
     </w:p>
@@ -664,7 +749,13 @@
       </w:r>
     </w:p>
     <w:p>
+      <w:pPr>
+        <w:ind w:left="360"/>
+      </w:pPr>
       <w:r>
+        <w:rPr>
+          <w:i/>
+        </w:rPr>
         <w:t>The nominal 50 degC packages stayed below set point, whereas nominal 19 degC packages reached about 23 degC; this different behaviour needs explanation.</w:t>
       </w:r>
     </w:p>
@@ -678,7 +769,7 @@
     </w:p>
     <w:p>
       <w:r>
-        <w:t>The newly available Results.xlsx workbook lets us answer this quantitatively. Late in the main trial, nominal 50 degC packages averaged 34.18 +/- 0.36 degC at top sensors and 26.08 +/- 0.23 degC at bottom sensors; nominal 19 degC packages averaged 23.50 +/- 0.21 degC at top sensors and 22.84 +/- 0.30 degC at bottom sensors. The manuscript now separates observed facts from interpretation. The observations are consistent with thermal inertia, chamber loading, heat-transfer resistance through the pallet/stack and airflow constraints, but the chamber model, airflow and occupancy data were not recorded, so these remain hypotheses rather than established causes.</w:t>
+        <w:t>We reanalysed the original temperature records to address this point quantitatively. Late in the main trial, nominal 50 degC packages averaged 34.18 +/- 0.36 degC at top sensors and 26.08 +/- 0.23 degC at bottom sensors; nominal 19 degC packages averaged 23.50 +/- 0.21 degC at top sensors and 22.84 +/- 0.30 degC at bottom sensors. The manuscript now separates observed facts from interpretation. The observations are consistent with thermal inertia, chamber loading, heat-transfer resistance through the pallet/stack and airflow constraints, but the chamber model, airflow and occupancy data were not recorded, so these remain hypotheses rather than established causes.</w:t>
       </w:r>
     </w:p>
     <w:p>
@@ -711,7 +802,13 @@
       </w:r>
     </w:p>
     <w:p>
+      <w:pPr>
+        <w:ind w:left="360"/>
+      </w:pPr>
       <w:r>
+        <w:rPr>
+          <w:i/>
+        </w:rPr>
         <w:t>The large difference between the main and verification experiment may indicate an error or scale effect.</w:t>
       </w:r>
     </w:p>
@@ -725,7 +822,7 @@
     </w:p>
     <w:p>
       <w:r>
-        <w:t>We do not dismiss the discrepancy. The verification workbook shows that the single three-box stack reached much warmer in-bag temperatures than the main nominal 50 degC trial, although no verification sensor reached 50 degC. Sensor maxima were 48.8 degC (V26 top, before dropout), 47.7 degC (V62 top), 45.0 degC (V27 bottom) and 47.6 degC (V64 bottom). Compared with the main trial late means, the verification trial was about 13.4 degC warmer at the top and about 20.2 degC warmer at the bottom. The final manuscript states that the discrepancy may reflect scale, chamber loading, stack geometry, airflow, chamber performance or sensor-location differences, but the available records do not identify a single cause. We therefore do not use the verification trial to correct or override the main trial; it is treated as a separate limited observation.</w:t>
+        <w:t>We do not dismiss the discrepancy. Detailed re-examination of the original verification-trial records showed that the single three-box stack reached much warmer in-bag temperatures than the main nominal 50 degC trial, although no verification sensor reached 50 degC. Sensor maxima were 48.8 degC (V26 top, before dropout), 47.7 degC (V62 top), 45.0 degC (V27 bottom) and 47.6 degC (V64 bottom). Compared with the main trial late means, the verification trial was about 13.4 degC warmer at the top and about 20.2 degC warmer at the bottom. The final manuscript states that the discrepancy may reflect scale, chamber loading, stack geometry, airflow, chamber performance or sensor-location differences, but the available records do not identify a single cause. We therefore do not use the verification trial to correct or override the main trial; it is treated as a separate limited observation.</w:t>
       </w:r>
     </w:p>
     <w:p>
@@ -758,7 +855,13 @@
       </w:r>
     </w:p>
     <w:p>
+      <w:pPr>
+        <w:ind w:left="360"/>
+      </w:pPr>
       <w:r>
+        <w:rPr>
+          <w:i/>
+        </w:rPr>
         <w:t>Several sentences are overly complex.</w:t>
       </w:r>
     </w:p>
@@ -772,7 +875,7 @@
     </w:p>
     <w:p>
       <w:r>
-        <w:t>The manuscript was edited throughout in the first revision and then edited again after the second-pass data audit. The final version uses shorter sentences and consistent terminology for nominal set point, nominal chamber condition and measured in-bag temperature.</w:t>
+        <w:t>The manuscript was edited throughout to improve clarity and to maintain consistent terminology for nominal set point, nominal chamber condition and measured in-bag temperature.</w:t>
       </w:r>
     </w:p>
     <w:p>
@@ -790,7 +893,7 @@
     </w:p>
     <w:sectPr>
       <w:pgSz w:w="12240" w:h="15840"/>
-      <w:pgMar w:top="1440" w:right="1800" w:bottom="1440" w:left="1800" w:header="720" w:footer="720" w:gutter="0"/>
+      <w:pgMar w:top="1440" w:right="1440" w:bottom="1440" w:left="1440" w:header="720" w:footer="720" w:gutter="0"/>
       <w:cols w:space="720"/>
       <w:docGrid w:linePitch="360"/>
     </w:sectPr>
@@ -1162,8 +1265,8 @@
     <w:qFormat/>
     <w:rsid w:val="00FC693F"/>
     <w:rPr>
-      <w:rFonts w:ascii="Arial" w:hAnsi="Arial"/>
-      <w:sz w:val="20"/>
+      <w:rFonts w:ascii="Times New Roman" w:hAnsi="Times New Roman"/>
+      <w:sz w:val="22"/>
     </w:rPr>
   </w:style>
   <w:style w:type="paragraph" w:styleId="Header">
@@ -1225,11 +1328,11 @@
       <w:outlineLvl w:val="0"/>
     </w:pPr>
     <w:rPr>
-      <w:rFonts w:asciiTheme="majorHAnsi" w:eastAsiaTheme="majorEastAsia" w:hAnsiTheme="majorHAnsi" w:cstheme="majorBidi"/>
+      <w:rFonts w:asciiTheme="majorHAnsi" w:eastAsiaTheme="majorEastAsia" w:hAnsiTheme="majorHAnsi" w:cstheme="majorBidi" w:ascii="Times New Roman" w:hAnsi="Times New Roman"/>
       <w:b/>
       <w:bCs/>
       <w:color w:val="365F91" w:themeColor="accent1" w:themeShade="BF"/>
-      <w:sz w:val="28"/>
+      <w:sz w:val="24"/>
       <w:szCs w:val="28"/>
     </w:rPr>
   </w:style>
@@ -1249,11 +1352,11 @@
       <w:outlineLvl w:val="1"/>
     </w:pPr>
     <w:rPr>
-      <w:rFonts w:asciiTheme="majorHAnsi" w:eastAsiaTheme="majorEastAsia" w:hAnsiTheme="majorHAnsi" w:cstheme="majorBidi"/>
+      <w:rFonts w:asciiTheme="majorHAnsi" w:eastAsiaTheme="majorEastAsia" w:hAnsiTheme="majorHAnsi" w:cstheme="majorBidi" w:ascii="Times New Roman" w:hAnsi="Times New Roman"/>
       <w:b/>
       <w:bCs/>
       <w:color w:val="4F81BD" w:themeColor="accent1"/>
-      <w:sz w:val="26"/>
+      <w:sz w:val="22"/>
       <w:szCs w:val="26"/>
     </w:rPr>
   </w:style>
@@ -1514,7 +1617,7 @@
       <w:contextualSpacing/>
     </w:pPr>
     <w:rPr>
-      <w:rFonts w:asciiTheme="majorHAnsi" w:eastAsiaTheme="majorEastAsia" w:hAnsiTheme="majorHAnsi" w:cstheme="majorBidi"/>
+      <w:rFonts w:asciiTheme="majorHAnsi" w:eastAsiaTheme="majorEastAsia" w:hAnsiTheme="majorHAnsi" w:cstheme="majorBidi" w:ascii="Times New Roman" w:hAnsi="Times New Roman"/>
       <w:color w:val="17365D" w:themeColor="text2" w:themeShade="BF"/>
       <w:spacing w:val="5"/>
       <w:kern w:val="28"/>
@@ -1694,6 +1797,9 @@
       </w:numPr>
       <w:contextualSpacing/>
     </w:pPr>
+    <w:rPr>
+      <w:rFonts w:ascii="Times New Roman" w:hAnsi="Times New Roman"/>
+    </w:rPr>
   </w:style>
   <w:style w:type="paragraph" w:styleId="ListBullet2">
     <w:name w:val="List Bullet 2"/>

</xml_diff>

<commit_message>
Address scientific go-no-go audit before resubmission
</commit_message>
<xml_diff>
--- a/Response_to_Reviewers.docx
+++ b/Response_to_Reviewers.docx
@@ -4,8 +4,7 @@
   <w:body>
     <w:p>
       <w:pPr>
-        <w:pStyle w:val="Title"/>
-        <w:jc w:val="center"/>
+        <w:pStyle w:val="Heading1"/>
       </w:pPr>
       <w:r>
         <w:t>Response to Reviewers</w:t>
@@ -13,23 +12,17 @@
     </w:p>
     <w:p>
       <w:r>
-        <w:rPr>
-          <w:b/>
-        </w:rPr>
-        <w:t>Manuscript:</w:t>
-      </w:r>
-      <w:r>
-        <w:t xml:space="preserve"> "Palletisation and In-Bag Thermal Exposure in Bag-in-Box Wine Packaging under Simulated Export Conditions"</w:t>
+        <w:t>Manuscript: "In-Bag Pressure and Temperature Monitoring of Palletised 3-L Bag-in-Box Wine under Static Chamber Conditions"</w:t>
       </w:r>
     </w:p>
     <w:p>
       <w:r>
-        <w:t>We thank Reviewer 2 and Reviewer 3 for their detailed assessment. In response to their comments, we undertook a comprehensive re-examination of the original experimental records and revised the manuscript accordingly. This included re-analysis of the main-trial pressure and temperature time-series, a sensitivity analysis of the initial handling period, a more detailed examination of the verification trial, and revision of Figures 3-7 to ensure that nominal chamber set points are clearly distinguished from measured in-bag temperatures. These analyses improve the transparency and traceability of the reported results but do not alter the underlying experimental design or its limitations.</w:t>
+        <w:t>We thank Reviewer 2 and Reviewer 3 for their detailed assessment. In response to their comments, we undertook a comprehensive re-examination of the original experimental records and revised the manuscript accordingly. This included re-analysis of the main-trial pressure and temperature time-series, an internal common-mode pressure diagnostic, a sensitivity analysis of the initial handling period, a descriptive-only presentation of Table 2 chemistry, a more detailed examination of the verification trial, and revision of Figures 3-7 to ensure that nominal chamber set points are clearly distinguished from measured in-bag temperatures. These analyses improve the transparency and traceability of the reported results but do not alter the underlying experimental design or its limitations.</w:t>
       </w:r>
     </w:p>
     <w:p>
       <w:pPr>
-        <w:pStyle w:val="Heading1"/>
+        <w:pStyle w:val="Heading2"/>
       </w:pPr>
       <w:r>
         <w:t>Reviewer 2</w:t>
@@ -37,7 +30,7 @@
     </w:p>
     <w:p>
       <w:pPr>
-        <w:pStyle w:val="Heading2"/>
+        <w:pStyle w:val="Heading3"/>
       </w:pPr>
       <w:r>
         <w:t>R2.1 Main trial did not achieve 50 degC</w:t>
@@ -45,26 +38,20 @@
     </w:p>
     <w:p>
       <w:pPr>
-        <w:pStyle w:val="Heading2"/>
+        <w:pStyle w:val="Heading3"/>
       </w:pPr>
       <w:r>
         <w:t>Reviewer Comment</w:t>
       </w:r>
     </w:p>
     <w:p>
-      <w:pPr>
-        <w:ind w:left="360"/>
-      </w:pPr>
       <w:r>
-        <w:rPr>
-          <w:i/>
-        </w:rPr>
         <w:t>The chamber was set at 50 degC, but the wine experienced about 25-34 degC; this changes the hypothesis test.</w:t>
       </w:r>
     </w:p>
     <w:p>
       <w:pPr>
-        <w:pStyle w:val="Heading2"/>
+        <w:pStyle w:val="Heading3"/>
       </w:pPr>
       <w:r>
         <w:t>Response</w:t>
@@ -77,7 +64,7 @@
     </w:p>
     <w:p>
       <w:pPr>
-        <w:pStyle w:val="Heading2"/>
+        <w:pStyle w:val="Heading3"/>
       </w:pPr>
       <w:r>
         <w:t>Changes in Manuscript</w:t>
@@ -90,7 +77,7 @@
     </w:p>
     <w:p>
       <w:pPr>
-        <w:pStyle w:val="Heading2"/>
+        <w:pStyle w:val="Heading3"/>
       </w:pPr>
       <w:r>
         <w:t>R2.2 Abstract</w:t>
@@ -98,26 +85,20 @@
     </w:p>
     <w:p>
       <w:pPr>
-        <w:pStyle w:val="Heading2"/>
+        <w:pStyle w:val="Heading3"/>
       </w:pPr>
       <w:r>
         <w:t>Reviewer Comment</w:t>
       </w:r>
     </w:p>
     <w:p>
-      <w:pPr>
-        <w:ind w:left="360"/>
-      </w:pPr>
       <w:r>
-        <w:rPr>
-          <w:i/>
-        </w:rPr>
         <w:t>The Abstract should be condensed, restructured and explicit about the actual temperatures.</w:t>
       </w:r>
     </w:p>
     <w:p>
       <w:pPr>
-        <w:pStyle w:val="Heading2"/>
+        <w:pStyle w:val="Heading3"/>
       </w:pPr>
       <w:r>
         <w:t>Response</w:t>
@@ -125,12 +106,12 @@
     </w:p>
     <w:p>
       <w:r>
-        <w:t>The Abstract has been revised to reflect the re-analysis of the original experimental records. It now reports the late-temperature summaries, the exploratory pressure effect estimate, the absence of a statistically detectable nominal chamber-condition effect, the summary-only scope of the chemistry data, and the limited role of the verification trial.</w:t>
+        <w:t>The Abstract has been revised to reflect the re-analysis of the original experimental records. It now reports the late-temperature summaries, the uncorrected exploratory pressure result, the common-mode pressure sensitivity, the descriptive-only scope of the chemistry data, and the limited role of the verification trial.</w:t>
       </w:r>
     </w:p>
     <w:p>
       <w:pPr>
-        <w:pStyle w:val="Heading2"/>
+        <w:pStyle w:val="Heading3"/>
       </w:pPr>
       <w:r>
         <w:t>Changes in Manuscript</w:t>
@@ -143,7 +124,7 @@
     </w:p>
     <w:p>
       <w:pPr>
-        <w:pStyle w:val="Heading2"/>
+        <w:pStyle w:val="Heading3"/>
       </w:pPr>
       <w:r>
         <w:t>R2.3 Chamber characteristics</w:t>
@@ -151,26 +132,20 @@
     </w:p>
     <w:p>
       <w:pPr>
-        <w:pStyle w:val="Heading2"/>
+        <w:pStyle w:val="Heading3"/>
       </w:pPr>
       <w:r>
         <w:t>Reviewer Comment</w:t>
       </w:r>
     </w:p>
     <w:p>
-      <w:pPr>
-        <w:ind w:left="360"/>
-      </w:pPr>
       <w:r>
-        <w:rPr>
-          <w:i/>
-        </w:rPr>
         <w:t>Chamber model, air circulation, fan power, chamber volume and pallet occupancy should be provided.</w:t>
       </w:r>
     </w:p>
     <w:p>
       <w:pPr>
-        <w:pStyle w:val="Heading2"/>
+        <w:pStyle w:val="Heading3"/>
       </w:pPr>
       <w:r>
         <w:t>Response</w:t>
@@ -183,7 +158,7 @@
     </w:p>
     <w:p>
       <w:pPr>
-        <w:pStyle w:val="Heading2"/>
+        <w:pStyle w:val="Heading3"/>
       </w:pPr>
       <w:r>
         <w:t>Changes in Manuscript</w:t>
@@ -196,7 +171,7 @@
     </w:p>
     <w:p>
       <w:pPr>
-        <w:pStyle w:val="Heading2"/>
+        <w:pStyle w:val="Heading3"/>
       </w:pPr>
       <w:r>
         <w:t>R2.4 Small sample size and ANOVA power</w:t>
@@ -204,26 +179,20 @@
     </w:p>
     <w:p>
       <w:pPr>
-        <w:pStyle w:val="Heading2"/>
+        <w:pStyle w:val="Heading3"/>
       </w:pPr>
       <w:r>
         <w:t>Reviewer Comment</w:t>
       </w:r>
     </w:p>
     <w:p>
-      <w:pPr>
-        <w:ind w:left="360"/>
-      </w:pPr>
       <w:r>
-        <w:rPr>
-          <w:i/>
-        </w:rPr>
         <w:t>The pressure ANOVA has very limited power because n is small and one bottom sensor is missing.</w:t>
       </w:r>
     </w:p>
     <w:p>
       <w:pPr>
-        <w:pStyle w:val="Heading2"/>
+        <w:pStyle w:val="Heading3"/>
       </w:pPr>
       <w:r>
         <w:t>Response</w:t>
@@ -231,12 +200,12 @@
     </w:p>
     <w:p>
       <w:r>
-        <w:t>We agree. The re-analysis improves reproducibility but does not change the replication status. We reanalysed the original main-trial sensor records and independently reconstructed the pressure summaries used in the statistical analysis. The reconstructed values match the reported summaries to 0.0000 mbar. However, the pressure cells remain n = 3, 3, 3 and 2, chamber condition remains one chamber per nominal set point, and the records do not retain stack IDs or sensor-to-stack pairings for a blocked or paired stack-level analysis. We therefore retain the ANOVA only as exploratory sensor-level inference and report effect estimates and confidence intervals alongside p-values.</w:t>
+        <w:t>We agree. The re-analysis improves reproducibility but does not change the replication status. We reanalysed the original main-trial sensor records and independently reconstructed the pressure summaries used in the statistical analysis. The reconstructed values match the reported summaries to 0.0000 mbar. However, the pressure cells remain n = 3, 3, 3 and 2, chamber condition remains one chamber per nominal set point, and the records do not retain stack IDs or sensor-to-stack pairings for a blocked or paired stack-level analysis. We also added an internal common-mode diagnostic because no barometric reference sensor was logged. The uncorrected peak-position result remains F(1,8) = 9.14 and p = 0.017, but the position term for each sensor's maximum common-mode residual was not statistically detectable (F(1,8) = 3.21; p = 0.111). We therefore present the pressure result as an exploratory transient position-related offset rather than a definitive package-mechanics effect.</w:t>
       </w:r>
     </w:p>
     <w:p>
       <w:pPr>
-        <w:pStyle w:val="Heading2"/>
+        <w:pStyle w:val="Heading3"/>
       </w:pPr>
       <w:r>
         <w:t>Changes in Manuscript</w:t>
@@ -244,12 +213,12 @@
     </w:p>
     <w:p>
       <w:r>
-        <w:t>Sections 2.2, 2.4, 3.2, 3.4 and Conclusions now state the experimental unit, the missing sensor, the unbalanced design, the unreplicated chamber factor and the exploratory interpretation. The analysis report and anova_pressure.py were updated to document the raw-workbook reconstruction.</w:t>
+        <w:t>Sections 2.2, 2.4, 3.2, 3.4 and Conclusions now state the experimental unit, the missing sensor, the unbalanced design, the unreplicated chamber factor, the absence of barometric reference logging and the exploratory interpretation. The analysis report and reproducibility scripts document the raw-workbook reconstruction and additional common-mode pressure diagnostics.</w:t>
       </w:r>
     </w:p>
     <w:p>
       <w:pPr>
-        <w:pStyle w:val="Heading2"/>
+        <w:pStyle w:val="Heading3"/>
       </w:pPr>
       <w:r>
         <w:t>R2.5 Verification trial n=1 stack</w:t>
@@ -257,26 +226,20 @@
     </w:p>
     <w:p>
       <w:pPr>
-        <w:pStyle w:val="Heading2"/>
+        <w:pStyle w:val="Heading3"/>
       </w:pPr>
       <w:r>
         <w:t>Reviewer Comment</w:t>
       </w:r>
     </w:p>
     <w:p>
-      <w:pPr>
-        <w:ind w:left="360"/>
-      </w:pPr>
       <w:r>
-        <w:rPr>
-          <w:i/>
-        </w:rPr>
         <w:t>The verification trial cannot confirm general conclusions because it used only one stack and one sensor failed.</w:t>
       </w:r>
     </w:p>
     <w:p>
       <w:pPr>
-        <w:pStyle w:val="Heading2"/>
+        <w:pStyle w:val="Heading3"/>
       </w:pPr>
       <w:r>
         <w:t>Response</w:t>
@@ -289,7 +252,7 @@
     </w:p>
     <w:p>
       <w:pPr>
-        <w:pStyle w:val="Heading2"/>
+        <w:pStyle w:val="Heading3"/>
       </w:pPr>
       <w:r>
         <w:t>Changes in Manuscript</w:t>
@@ -302,7 +265,7 @@
     </w:p>
     <w:p>
       <w:pPr>
-        <w:pStyle w:val="Heading2"/>
+        <w:pStyle w:val="Heading3"/>
       </w:pPr>
       <w:r>
         <w:t>R2.6 Physical-versus-chemical binary conclusion</w:t>
@@ -310,26 +273,20 @@
     </w:p>
     <w:p>
       <w:pPr>
-        <w:pStyle w:val="Heading2"/>
+        <w:pStyle w:val="Heading3"/>
       </w:pPr>
       <w:r>
         <w:t>Reviewer Comment</w:t>
       </w:r>
     </w:p>
     <w:p>
-      <w:pPr>
-        <w:ind w:left="360"/>
-      </w:pPr>
       <w:r>
-        <w:rPr>
-          <w:i/>
-        </w:rPr>
         <w:t>The claim that palletisation governs physical behaviour and temperature governs chemical stability is overreaching because chemistry was not position-resolved.</w:t>
       </w:r>
     </w:p>
     <w:p>
       <w:pPr>
-        <w:pStyle w:val="Heading2"/>
+        <w:pStyle w:val="Heading3"/>
       </w:pPr>
       <w:r>
         <w:t>Response</w:t>
@@ -337,12 +294,12 @@
     </w:p>
     <w:p>
       <w:r>
-        <w:t>We agree. The manuscript no longer presents this binary causal attribution. The original study records do not contain position-resolved chemistry. The final text states that pressure was measured by package position and showed a transient bottom-position peak, whereas chemistry was measured as bulk wine grouped by nominal chamber condition. These two datasets support different descriptive response patterns, but they do not demonstrate that palletisation and temperature act independently or exclusively on separate parts of the system.</w:t>
+        <w:t>We agree. The manuscript no longer presents this binary causal attribution. The original study records do not contain position-resolved chemistry. The final text states that pressure was measured by package position and showed transient position-related offsets superimposed on a common-mode absolute-pressure component, whereas chemistry is presented as descriptive bulk summaries grouped by nominal chamber condition. These two datasets support different descriptive response patterns, but they do not demonstrate that palletisation and temperature act independently or exclusively on separate parts of the system.</w:t>
       </w:r>
     </w:p>
     <w:p>
       <w:pPr>
-        <w:pStyle w:val="Heading2"/>
+        <w:pStyle w:val="Heading3"/>
       </w:pPr>
       <w:r>
         <w:t>Changes in Manuscript</w:t>
@@ -350,12 +307,12 @@
     </w:p>
     <w:p>
       <w:r>
-        <w:t>The Abstract, Discussion, Limitations and Conclusions were revised; unsupported "governs" language was removed.</w:t>
+        <w:t>The Abstract, Discussion, Limitations and Conclusions were revised; unsupported "governs" language was removed and the pressure interpretation was further limited by the common-mode diagnostic.</w:t>
       </w:r>
     </w:p>
     <w:p>
       <w:pPr>
-        <w:pStyle w:val="Heading2"/>
+        <w:pStyle w:val="Heading3"/>
       </w:pPr>
       <w:r>
         <w:t>R2.7 Lactic acid interpretation</w:t>
@@ -363,26 +320,20 @@
     </w:p>
     <w:p>
       <w:pPr>
-        <w:pStyle w:val="Heading2"/>
+        <w:pStyle w:val="Heading3"/>
       </w:pPr>
       <w:r>
         <w:t>Reviewer Comment</w:t>
       </w:r>
     </w:p>
     <w:p>
-      <w:pPr>
-        <w:ind w:left="360"/>
-      </w:pPr>
       <w:r>
-        <w:rPr>
-          <w:i/>
-        </w:rPr>
         <w:t>The lactic-acid increase cannot be confidently attributed to heat-driven chemistry rather than malolactic fermentation without microbiological data.</w:t>
       </w:r>
     </w:p>
     <w:p>
       <w:pPr>
-        <w:pStyle w:val="Heading2"/>
+        <w:pStyle w:val="Heading3"/>
       </w:pPr>
       <w:r>
         <w:t>Response</w:t>
@@ -390,12 +341,12 @@
     </w:p>
     <w:p>
       <w:r>
-        <w:t>We agree. We re-examined the available original experimental records and confirmed that raw replicate-level chemical measurements were not retained in the available study records. The originally submitted Table 2 reports 0.29 +/- 0.02 g/L, whereas no primary experimental record supports the alternative 0.29 +/- 0.20 g/L. The manuscript therefore reports 0.29 +/- 0.02 g/L as the traceable descriptive Table 2 value, without a significance claim. We state that malic acid did not show the clear decrease expected for a simple malolactic-conversion interpretation, but we no longer state that malolactic fermentation was ruled out. Residual microbial activity cannot be excluded.</w:t>
+        <w:t>We agree. We re-examined the available original experimental records and confirmed that raw replicate-level chemical measurements were not retained in the available study records. The originally submitted Table 2 reports `0.29 +/- 0.02 g/L`, whereas no primary experimental record supports the alternative `0.29 +/- 0.20 g/L`. The manuscript therefore reports `0.29 +/- 0.02 g/L` as the traceable descriptive Table 2 value, without a significance claim. Because independent treatment-level replication cannot be verified for the chemistry table, Tukey letters and chemistry p-values have been removed. Malic acid was numerically similar between conditions, but we no longer state that malolactic fermentation was ruled out. Residual microbial activity cannot be excluded.</w:t>
       </w:r>
     </w:p>
     <w:p>
       <w:pPr>
-        <w:pStyle w:val="Heading2"/>
+        <w:pStyle w:val="Heading3"/>
       </w:pPr>
       <w:r>
         <w:t>Changes in Manuscript</w:t>
@@ -403,12 +354,12 @@
     </w:p>
     <w:p>
       <w:r>
-        <w:t>Sections 2.4 and 3.1, Table 2 and Limitations were revised to report lactic acid descriptively using the traceable 0.29 +/- 0.02 g/L value and to state the absence of raw chemical replicates, microbiology, viable cell counts and method-sensitivity data.</w:t>
+        <w:t>Sections 2.1, 2.4 and 3.1, Table 2 and Limitations were revised to report chemistry descriptively using the traceable Table 2 values and to state the absence of raw chemical replicates, microbiology, viable cell counts and method-sensitivity data.</w:t>
       </w:r>
     </w:p>
     <w:p>
       <w:pPr>
-        <w:pStyle w:val="Heading2"/>
+        <w:pStyle w:val="Heading3"/>
       </w:pPr>
       <w:r>
         <w:t>R2.8 Table 2 labels</w:t>
@@ -416,26 +367,20 @@
     </w:p>
     <w:p>
       <w:pPr>
-        <w:pStyle w:val="Heading2"/>
+        <w:pStyle w:val="Heading3"/>
       </w:pPr>
       <w:r>
         <w:t>Reviewer Comment</w:t>
       </w:r>
     </w:p>
     <w:p>
-      <w:pPr>
-        <w:ind w:left="360"/>
-      </w:pPr>
       <w:r>
-        <w:rPr>
-          <w:i/>
-        </w:rPr>
         <w:t>"Wine at 19 degC" and "Wine at 50 degC" are misleading.</w:t>
       </w:r>
     </w:p>
     <w:p>
       <w:pPr>
-        <w:pStyle w:val="Heading2"/>
+        <w:pStyle w:val="Heading3"/>
       </w:pPr>
       <w:r>
         <w:t>Response</w:t>
@@ -443,12 +388,12 @@
     </w:p>
     <w:p>
       <w:r>
-        <w:t>Corrected. Table 2 now labels the rows as wine from the nominal 19 degC chamber and wine from the nominal 50 degC chamber. The caption states that these labels are chamber set points, not actual in-bag wine temperatures.</w:t>
+        <w:t>Corrected. Table 2 now labels the rows as wine from the nominal 19 degC chamber and wine from the nominal 50 degC chamber. The caption states that these labels are chamber set points, not actual in-bag wine temperatures. Because independent treatment-level replication could not be verified for the chemistry records, the table now reports descriptive summaries only and contains no significance letters. Because independent treatment-level replication could not be verified for the chemistry records, the table now reports descriptive summaries only and contains no significance letters.</w:t>
       </w:r>
     </w:p>
     <w:p>
       <w:pPr>
-        <w:pStyle w:val="Heading2"/>
+        <w:pStyle w:val="Heading3"/>
       </w:pPr>
       <w:r>
         <w:t>Changes in Manuscript</w:t>
@@ -456,12 +401,12 @@
     </w:p>
     <w:p>
       <w:r>
-        <w:t>Table 2 row labels, caption and note were revised and highlighted.</w:t>
+        <w:t>Table 2 row labels, caption, values and note were revised and highlighted; significance letters were removed.</w:t>
       </w:r>
     </w:p>
     <w:p>
       <w:pPr>
-        <w:pStyle w:val="Heading2"/>
+        <w:pStyle w:val="Heading3"/>
       </w:pPr>
       <w:r>
         <w:t>R2.9 First five hours excluded</w:t>
@@ -469,26 +414,20 @@
     </w:p>
     <w:p>
       <w:pPr>
-        <w:pStyle w:val="Heading2"/>
+        <w:pStyle w:val="Heading3"/>
       </w:pPr>
       <w:r>
         <w:t>Reviewer Comment</w:t>
       </w:r>
     </w:p>
     <w:p>
-      <w:pPr>
-        <w:ind w:left="360"/>
-      </w:pPr>
       <w:r>
-        <w:rPr>
-          <w:i/>
-        </w:rPr>
         <w:t>The first five hours may represent realistic transport disturbances and should be discussed or tested by sensitivity analysis.</w:t>
       </w:r>
     </w:p>
     <w:p>
       <w:pPr>
-        <w:pStyle w:val="Heading2"/>
+        <w:pStyle w:val="Heading3"/>
       </w:pPr>
       <w:r>
         <w:t>Response</w:t>
@@ -501,7 +440,7 @@
     </w:p>
     <w:p>
       <w:pPr>
-        <w:pStyle w:val="Heading2"/>
+        <w:pStyle w:val="Heading3"/>
       </w:pPr>
       <w:r>
         <w:t>Changes in Manuscript</w:t>
@@ -514,7 +453,7 @@
     </w:p>
     <w:p>
       <w:pPr>
-        <w:pStyle w:val="Heading2"/>
+        <w:pStyle w:val="Heading3"/>
       </w:pPr>
       <w:r>
         <w:t>R2.10 Wine identity</w:t>
@@ -522,26 +461,20 @@
     </w:p>
     <w:p>
       <w:pPr>
-        <w:pStyle w:val="Heading2"/>
+        <w:pStyle w:val="Heading3"/>
       </w:pPr>
       <w:r>
         <w:t>Reviewer Comment</w:t>
       </w:r>
     </w:p>
     <w:p>
-      <w:pPr>
-        <w:ind w:left="360"/>
-      </w:pPr>
       <w:r>
-        <w:rPr>
-          <w:i/>
-        </w:rPr>
         <w:t>Grape variety and vintage are unknown.</w:t>
       </w:r>
     </w:p>
     <w:p>
       <w:pPr>
-        <w:pStyle w:val="Heading2"/>
+        <w:pStyle w:val="Heading3"/>
       </w:pPr>
       <w:r>
         <w:t>Response</w:t>
@@ -554,7 +487,7 @@
     </w:p>
     <w:p>
       <w:pPr>
-        <w:pStyle w:val="Heading2"/>
+        <w:pStyle w:val="Heading3"/>
       </w:pPr>
       <w:r>
         <w:t>Changes in Manuscript</w:t>
@@ -567,7 +500,7 @@
     </w:p>
     <w:p>
       <w:pPr>
-        <w:pStyle w:val="Heading1"/>
+        <w:pStyle w:val="Heading2"/>
       </w:pPr>
       <w:r>
         <w:t>Reviewer 3</w:t>
@@ -575,7 +508,7 @@
     </w:p>
     <w:p>
       <w:pPr>
-        <w:pStyle w:val="Heading2"/>
+        <w:pStyle w:val="Heading3"/>
       </w:pPr>
       <w:r>
         <w:t>R3.1 Stacking configuration and interpretability</w:t>
@@ -583,26 +516,20 @@
     </w:p>
     <w:p>
       <w:pPr>
-        <w:pStyle w:val="Heading2"/>
+        <w:pStyle w:val="Heading3"/>
       </w:pPr>
       <w:r>
         <w:t>Reviewer Comment</w:t>
       </w:r>
     </w:p>
     <w:p>
-      <w:pPr>
-        <w:ind w:left="360"/>
-      </w:pPr>
       <w:r>
-        <w:rPr>
-          <w:i/>
-        </w:rPr>
         <w:t>It is difficult to evaluate stacking configuration because different configurations and temperatures may be confounded or averaged.</w:t>
       </w:r>
     </w:p>
     <w:p>
       <w:pPr>
-        <w:pStyle w:val="Heading2"/>
+        <w:pStyle w:val="Heading3"/>
       </w:pPr>
       <w:r>
         <w:t>Response</w:t>
@@ -610,12 +537,12 @@
     </w:p>
     <w:p>
       <w:r>
-        <w:t>We appreciate this point. The final manuscript clarifies that the pressure analysis evaluates top versus bottom package position under the tested stack configuration. Stack height was not analysed as an independent factor because the design contained one four-box stack and two three-box stacks per nominal chamber condition. Re-examination of the original main-trial records confirmed the available sensor traces and position/chamber mapping; however, stack identifiers or sensor-to-stack pairings were not retained. Chamber condition also remains unreplicated at the chamber level. The pressure ANOVA is therefore presented as exploratory sensor-level analysis rather than a definitive test of stack height, chamber temperature or paired stack effects.</w:t>
+        <w:t>We appreciate this point. The final manuscript clarifies that the pressure analysis evaluates top versus bottom package position under the tested stack configuration. Stack height was not analysed as an independent factor because the design contained one four-box stack and two three-box stacks per nominal chamber condition. Re-examination of the original main-trial records confirmed the available sensor traces and position/chamber mapping; however, stack identifiers or sensor-to-stack pairings were not retained. Chamber condition also remains unreplicated at the chamber level, and no barometric reference was logged. The pressure ANOVA is therefore presented as exploratory sensor-level analysis rather than a definitive test of stack height, chamber temperature, package mechanics or paired stack effects.</w:t>
       </w:r>
     </w:p>
     <w:p>
       <w:pPr>
-        <w:pStyle w:val="Heading2"/>
+        <w:pStyle w:val="Heading3"/>
       </w:pPr>
       <w:r>
         <w:t>Changes in Manuscript</w:t>
@@ -628,7 +555,7 @@
     </w:p>
     <w:p>
       <w:pPr>
-        <w:pStyle w:val="Heading2"/>
+        <w:pStyle w:val="Heading3"/>
       </w:pPr>
       <w:r>
         <w:t>R3.2 SO2 reduction and post-transport shelf life</w:t>
@@ -636,26 +563,20 @@
     </w:p>
     <w:p>
       <w:pPr>
-        <w:pStyle w:val="Heading2"/>
+        <w:pStyle w:val="Heading3"/>
       </w:pPr>
       <w:r>
         <w:t>Reviewer Comment</w:t>
       </w:r>
     </w:p>
     <w:p>
-      <w:pPr>
-        <w:ind w:left="360"/>
-      </w:pPr>
       <w:r>
-        <w:rPr>
-          <w:i/>
-        </w:rPr>
         <w:t>Could SO2 loss affect shelf life and storage after transport?</w:t>
       </w:r>
     </w:p>
     <w:p>
       <w:pPr>
-        <w:pStyle w:val="Heading2"/>
+        <w:pStyle w:val="Heading3"/>
       </w:pPr>
       <w:r>
         <w:t>Response</w:t>
@@ -668,7 +589,7 @@
     </w:p>
     <w:p>
       <w:pPr>
-        <w:pStyle w:val="Heading2"/>
+        <w:pStyle w:val="Heading3"/>
       </w:pPr>
       <w:r>
         <w:t>Changes in Manuscript</w:t>
@@ -681,7 +602,7 @@
     </w:p>
     <w:p>
       <w:pPr>
-        <w:pStyle w:val="Heading2"/>
+        <w:pStyle w:val="Heading3"/>
       </w:pPr>
       <w:r>
         <w:t>R3.3 Economic feasibility of pressure sensors</w:t>
@@ -689,26 +610,20 @@
     </w:p>
     <w:p>
       <w:pPr>
-        <w:pStyle w:val="Heading2"/>
+        <w:pStyle w:val="Heading3"/>
       </w:pPr>
       <w:r>
         <w:t>Reviewer Comment</w:t>
       </w:r>
     </w:p>
     <w:p>
-      <w:pPr>
-        <w:ind w:left="360"/>
-      </w:pPr>
       <w:r>
-        <w:rPr>
-          <w:i/>
-        </w:rPr>
         <w:t>The feasibility of using pressure sensors at scale is unclear.</w:t>
       </w:r>
     </w:p>
     <w:p>
       <w:pPr>
-        <w:pStyle w:val="Heading2"/>
+        <w:pStyle w:val="Heading3"/>
       </w:pPr>
       <w:r>
         <w:t>Response</w:t>
@@ -721,7 +636,7 @@
     </w:p>
     <w:p>
       <w:pPr>
-        <w:pStyle w:val="Heading2"/>
+        <w:pStyle w:val="Heading3"/>
       </w:pPr>
       <w:r>
         <w:t>Changes in Manuscript</w:t>
@@ -734,7 +649,7 @@
     </w:p>
     <w:p>
       <w:pPr>
-        <w:pStyle w:val="Heading2"/>
+        <w:pStyle w:val="Heading3"/>
       </w:pPr>
       <w:r>
         <w:t>R3.4 Thermal behaviour under nominal 19 degC and nominal 50 degC conditions</w:t>
@@ -742,26 +657,20 @@
     </w:p>
     <w:p>
       <w:pPr>
-        <w:pStyle w:val="Heading2"/>
+        <w:pStyle w:val="Heading3"/>
       </w:pPr>
       <w:r>
         <w:t>Reviewer Comment</w:t>
       </w:r>
     </w:p>
     <w:p>
-      <w:pPr>
-        <w:ind w:left="360"/>
-      </w:pPr>
       <w:r>
-        <w:rPr>
-          <w:i/>
-        </w:rPr>
         <w:t>The nominal 50 degC packages stayed below set point, whereas nominal 19 degC packages reached about 23 degC; this different behaviour needs explanation.</w:t>
       </w:r>
     </w:p>
     <w:p>
       <w:pPr>
-        <w:pStyle w:val="Heading2"/>
+        <w:pStyle w:val="Heading3"/>
       </w:pPr>
       <w:r>
         <w:t>Response</w:t>
@@ -769,12 +678,12 @@
     </w:p>
     <w:p>
       <w:r>
-        <w:t>We reanalysed the original temperature records to address this point quantitatively. Late in the main trial, nominal 50 degC packages averaged 34.18 +/- 0.36 degC at top sensors and 26.08 +/- 0.23 degC at bottom sensors; nominal 19 degC packages averaged 23.50 +/- 0.21 degC at top sensors and 22.84 +/- 0.30 degC at bottom sensors. The manuscript now separates observed facts from interpretation. The observations are consistent with thermal inertia, chamber loading, heat-transfer resistance through the pallet/stack and airflow constraints, but the chamber model, airflow and occupancy data were not recorded, so these remain hypotheses rather than established causes.</w:t>
+        <w:t>We reanalysed the original temperature records to address this point quantitatively. Late in the main trial, nominal 50 degC packages averaged 34.18 +/- 0.36 degC at top sensors and 26.08 +/- 0.23 degC at bottom sensors; nominal 19 degC packages averaged 23.50 +/- 0.21 degC at top sensors and 22.84 +/- 0.30 degC at bottom sensors. The manuscript now separates observed facts from interpretation. By the end of storage, the main-trial temperatures were stable far below the nominal 50 degC set point, suggesting sustained under-delivery and/or stratification of the effective thermal environment rather than only a short transient lag. Because no chamber-air logger, chamber model, airflow or occupancy data were recorded, the chamber mechanism cannot be resolved.</w:t>
       </w:r>
     </w:p>
     <w:p>
       <w:pPr>
-        <w:pStyle w:val="Heading2"/>
+        <w:pStyle w:val="Heading3"/>
       </w:pPr>
       <w:r>
         <w:t>Changes in Manuscript</w:t>
@@ -782,12 +691,12 @@
     </w:p>
     <w:p>
       <w:r>
-        <w:t>Sections 3.2, 3.3, 3.4 and the captions to Figures 3 and 6 were revised with the quantified temperatures and cautious interpretation.</w:t>
+        <w:t>Sections 3.2, 3.3, 3.4 and the captions to Figures 3 and 6 were revised with the quantified temperatures and the sustained-under-delivery/stratification limitation.</w:t>
       </w:r>
     </w:p>
     <w:p>
       <w:pPr>
-        <w:pStyle w:val="Heading2"/>
+        <w:pStyle w:val="Heading3"/>
       </w:pPr>
       <w:r>
         <w:t>R3.5 Main experiment versus verification experiment discrepancy</w:t>
@@ -795,26 +704,20 @@
     </w:p>
     <w:p>
       <w:pPr>
-        <w:pStyle w:val="Heading2"/>
+        <w:pStyle w:val="Heading3"/>
       </w:pPr>
       <w:r>
         <w:t>Reviewer Comment</w:t>
       </w:r>
     </w:p>
     <w:p>
-      <w:pPr>
-        <w:ind w:left="360"/>
-      </w:pPr>
       <w:r>
-        <w:rPr>
-          <w:i/>
-        </w:rPr>
         <w:t>The large difference between the main and verification experiment may indicate an error or scale effect.</w:t>
       </w:r>
     </w:p>
     <w:p>
       <w:pPr>
-        <w:pStyle w:val="Heading2"/>
+        <w:pStyle w:val="Heading3"/>
       </w:pPr>
       <w:r>
         <w:t>Response</w:t>
@@ -827,7 +730,7 @@
     </w:p>
     <w:p>
       <w:pPr>
-        <w:pStyle w:val="Heading2"/>
+        <w:pStyle w:val="Heading3"/>
       </w:pPr>
       <w:r>
         <w:t>Changes in Manuscript</w:t>
@@ -840,7 +743,7 @@
     </w:p>
     <w:p>
       <w:pPr>
-        <w:pStyle w:val="Heading2"/>
+        <w:pStyle w:val="Heading3"/>
       </w:pPr>
       <w:r>
         <w:t>R3.6 English readability</w:t>
@@ -848,26 +751,20 @@
     </w:p>
     <w:p>
       <w:pPr>
-        <w:pStyle w:val="Heading2"/>
+        <w:pStyle w:val="Heading3"/>
       </w:pPr>
       <w:r>
         <w:t>Reviewer Comment</w:t>
       </w:r>
     </w:p>
     <w:p>
-      <w:pPr>
-        <w:ind w:left="360"/>
-      </w:pPr>
       <w:r>
-        <w:rPr>
-          <w:i/>
-        </w:rPr>
         <w:t>Several sentences are overly complex.</w:t>
       </w:r>
     </w:p>
     <w:p>
       <w:pPr>
-        <w:pStyle w:val="Heading2"/>
+        <w:pStyle w:val="Heading3"/>
       </w:pPr>
       <w:r>
         <w:t>Response</w:t>
@@ -880,7 +777,7 @@
     </w:p>
     <w:p>
       <w:pPr>
-        <w:pStyle w:val="Heading2"/>
+        <w:pStyle w:val="Heading3"/>
       </w:pPr>
       <w:r>
         <w:t>Changes in Manuscript</w:t>
@@ -1328,11 +1225,11 @@
       <w:outlineLvl w:val="0"/>
     </w:pPr>
     <w:rPr>
-      <w:rFonts w:asciiTheme="majorHAnsi" w:eastAsiaTheme="majorEastAsia" w:hAnsiTheme="majorHAnsi" w:cstheme="majorBidi" w:ascii="Times New Roman" w:hAnsi="Times New Roman"/>
+      <w:rFonts w:asciiTheme="majorHAnsi" w:eastAsiaTheme="majorEastAsia" w:hAnsiTheme="majorHAnsi" w:cstheme="majorBidi"/>
       <w:b/>
       <w:bCs/>
       <w:color w:val="365F91" w:themeColor="accent1" w:themeShade="BF"/>
-      <w:sz w:val="24"/>
+      <w:sz w:val="28"/>
       <w:szCs w:val="28"/>
     </w:rPr>
   </w:style>
@@ -1352,11 +1249,11 @@
       <w:outlineLvl w:val="1"/>
     </w:pPr>
     <w:rPr>
-      <w:rFonts w:asciiTheme="majorHAnsi" w:eastAsiaTheme="majorEastAsia" w:hAnsiTheme="majorHAnsi" w:cstheme="majorBidi" w:ascii="Times New Roman" w:hAnsi="Times New Roman"/>
+      <w:rFonts w:asciiTheme="majorHAnsi" w:eastAsiaTheme="majorEastAsia" w:hAnsiTheme="majorHAnsi" w:cstheme="majorBidi"/>
       <w:b/>
       <w:bCs/>
       <w:color w:val="4F81BD" w:themeColor="accent1"/>
-      <w:sz w:val="22"/>
+      <w:sz w:val="26"/>
       <w:szCs w:val="26"/>
     </w:rPr>
   </w:style>
@@ -1617,7 +1514,7 @@
       <w:contextualSpacing/>
     </w:pPr>
     <w:rPr>
-      <w:rFonts w:asciiTheme="majorHAnsi" w:eastAsiaTheme="majorEastAsia" w:hAnsiTheme="majorHAnsi" w:cstheme="majorBidi" w:ascii="Times New Roman" w:hAnsi="Times New Roman"/>
+      <w:rFonts w:asciiTheme="majorHAnsi" w:eastAsiaTheme="majorEastAsia" w:hAnsiTheme="majorHAnsi" w:cstheme="majorBidi"/>
       <w:color w:val="17365D" w:themeColor="text2" w:themeShade="BF"/>
       <w:spacing w:val="5"/>
       <w:kern w:val="28"/>
@@ -1797,9 +1694,6 @@
       </w:numPr>
       <w:contextualSpacing/>
     </w:pPr>
-    <w:rPr>
-      <w:rFonts w:ascii="Times New Roman" w:hAnsi="Times New Roman"/>
-    </w:rPr>
   </w:style>
   <w:style w:type="paragraph" w:styleId="ListBullet2">
     <w:name w:val="List Bullet 2"/>

</xml_diff>

<commit_message>
Restore approved chemistry presentation after pressure audit
</commit_message>
<xml_diff>
--- a/Response_to_Reviewers.docx
+++ b/Response_to_Reviewers.docx
@@ -17,7 +17,7 @@
     </w:p>
     <w:p>
       <w:r>
-        <w:t>We thank Reviewer 2 and Reviewer 3 for their detailed assessment. In response to their comments, we undertook a comprehensive re-examination of the original experimental records and revised the manuscript accordingly. This included re-analysis of the main-trial pressure and temperature time-series, an internal common-mode pressure diagnostic, a sensitivity analysis of the initial handling period, a descriptive-only presentation of Table 2 chemistry, a more detailed examination of the verification trial, and revision of Figures 3-7 to ensure that nominal chamber set points are clearly distinguished from measured in-bag temperatures. These analyses improve the transparency and traceability of the reported results but do not alter the underlying experimental design or its limitations.</w:t>
+        <w:t>We thank Reviewer 2 and Reviewer 3 for their detailed assessment. In response to their comments, we undertook a comprehensive re-examination of the original experimental records and revised the manuscript accordingly. This included re-analysis of the main-trial pressure and temperature time-series, an internal common-mode pressure diagnostic, a sensitivity analysis of the initial handling period, a more detailed examination of the verification trial, and revision of Figures 3-7 to ensure that nominal chamber set points are clearly distinguished from measured in-bag temperatures. These analyses improve the transparency and traceability of the reported results but do not alter the underlying experimental design or its limitations.</w:t>
       </w:r>
     </w:p>
     <w:p>
@@ -106,7 +106,7 @@
     </w:p>
     <w:p>
       <w:r>
-        <w:t>The Abstract has been revised to reflect the re-analysis of the original experimental records. It now reports the late-temperature summaries, the uncorrected exploratory pressure result, the common-mode pressure sensitivity, the descriptive-only scope of the chemistry data, and the limited role of the verification trial.</w:t>
+        <w:t>The Abstract has been revised to reflect the re-analysis of the original experimental records. It now reports the late-temperature summaries, the uncorrected exploratory pressure result, the common-mode pressure sensitivity, the approved Table 2 chemistry presentation, and the limited role of the verification trial.</w:t>
       </w:r>
     </w:p>
     <w:p>
@@ -294,7 +294,7 @@
     </w:p>
     <w:p>
       <w:r>
-        <w:t>We agree. The manuscript no longer presents this binary causal attribution. The original study records do not contain position-resolved chemistry. The final text states that pressure was measured by package position and showed transient position-related offsets superimposed on a common-mode absolute-pressure component, whereas chemistry is presented as descriptive bulk summaries grouped by nominal chamber condition. These two datasets support different descriptive response patterns, but they do not demonstrate that palletisation and temperature act independently or exclusively on separate parts of the system.</w:t>
+        <w:t>We agree. The manuscript no longer presents this binary causal attribution. The original study records do not contain position-resolved chemistry. The final text states that pressure was measured by package position and showed transient position-related offsets superimposed on a common-mode absolute-pressure component, whereas chemistry was measured as bulk wine grouped by nominal chamber condition. These two datasets support different descriptive response patterns, but they do not demonstrate that palletisation and temperature act independently or exclusively on separate parts of the system.</w:t>
       </w:r>
     </w:p>
     <w:p>
@@ -341,7 +341,7 @@
     </w:p>
     <w:p>
       <w:r>
-        <w:t>We agree. We re-examined the available original experimental records and confirmed that raw replicate-level chemical measurements were not retained in the available study records. The originally submitted Table 2 reports `0.29 +/- 0.02 g/L`, whereas no primary experimental record supports the alternative `0.29 +/- 0.20 g/L`. The manuscript therefore reports `0.29 +/- 0.02 g/L` as the traceable descriptive Table 2 value, without a significance claim. Because independent treatment-level replication cannot be verified for the chemistry table, Tukey letters and chemistry p-values have been removed. Malic acid was numerically similar between conditions, but we no longer state that malolactic fermentation was ruled out. Residual microbial activity cannot be excluded.</w:t>
+        <w:t>We agree. We re-examined the available original experimental records and confirmed that raw replicate-level chemical measurements were not retained in the available study records. The originally submitted Table 2 reports `0.29 +/- 0.02 g/L`, whereas no primary experimental record supports the alternative `0.29 +/- 0.20 g/L`. The manuscript therefore reports `0.29 +/- 0.02 g/L` as the traceable descriptive Table 2 value, without a significance claim. Lactic acid remains reported descriptively without significance letters. Malic acid did not decrease significantly, but we no longer state that malolactic fermentation was ruled out. Residual microbial activity cannot be excluded.</w:t>
       </w:r>
     </w:p>
     <w:p>
@@ -354,7 +354,7 @@
     </w:p>
     <w:p>
       <w:r>
-        <w:t>Sections 2.1, 2.4 and 3.1, Table 2 and Limitations were revised to report chemistry descriptively using the traceable Table 2 values and to state the absence of raw chemical replicates, microbiology, viable cell counts and method-sensitivity data.</w:t>
+        <w:t>Sections 2.1, 2.4 and 3.1, Table 2 and Limitations were revised to retain the approved Table 2 chemistry presentation, report lactic acid cautiously using the traceable `0.29 +/- 0.02 g/L` value, and state the absence of raw chemical replicates, microbiology, viable cell counts and method-sensitivity data.</w:t>
       </w:r>
     </w:p>
     <w:p>
@@ -388,7 +388,7 @@
     </w:p>
     <w:p>
       <w:r>
-        <w:t>Corrected. Table 2 now labels the rows as wine from the nominal 19 degC chamber and wine from the nominal 50 degC chamber. The caption states that these labels are chamber set points, not actual in-bag wine temperatures. Because independent treatment-level replication could not be verified for the chemistry records, the table now reports descriptive summaries only and contains no significance letters. Because independent treatment-level replication could not be verified for the chemistry records, the table now reports descriptive summaries only and contains no significance letters.</w:t>
+        <w:t>Corrected. Table 2 now labels the rows as wine from the nominal 19 degC chamber and wine from the nominal 50 degC chamber. The caption states that these labels are chamber set points, not actual in-bag wine temperatures. The approved Table 2 chemistry markers are retained, while lactic acid remains descriptive without significance letters.</w:t>
       </w:r>
     </w:p>
     <w:p>
@@ -401,7 +401,7 @@
     </w:p>
     <w:p>
       <w:r>
-        <w:t>Table 2 row labels, caption, values and note were revised and highlighted; significance letters were removed.</w:t>
+        <w:t>Table 2 row labels, caption, values and note were revised and highlighted; the approved chemistry significance letters were restored except for lactic acid, which remains descriptive.</w:t>
       </w:r>
     </w:p>
     <w:p>

</xml_diff>

<commit_message>
Improve manuscript clarity without changing science
</commit_message>
<xml_diff>
--- a/Response_to_Reviewers.docx
+++ b/Response_to_Reviewers.docx
@@ -17,7 +17,7 @@
     </w:p>
     <w:p>
       <w:r>
-        <w:t>We thank Reviewer 2 and Reviewer 3 for their detailed assessment. In response to their comments, we undertook a comprehensive re-examination of the original experimental records and revised the manuscript accordingly. This included re-analysis of the main-trial pressure and temperature time-series, an internal common-mode pressure diagnostic, a sensitivity analysis of the initial handling period, a more detailed examination of the verification trial, and revision of Figures 3-7 to ensure that nominal chamber set points are clearly distinguished from measured in-bag temperatures. These analyses improve the transparency and traceability of the reported results but do not alter the underlying experimental design or its limitations.</w:t>
+        <w:t>We thank Reviewer 2 and Reviewer 3 for their detailed assessment. In response to their comments, we undertook a comprehensive re-examination of the original experimental records and revised the manuscript accordingly. This included re-analysis of the main-trial pressure and temperature time-series, an internal common-mode pressure diagnostic, a sensitivity analysis of the initial handling period, a more detailed examination of the verification trial, and revision of Figures 3-7 to ensure that chamber set-point labels are clearly distinguished from measured in-bag temperatures. These analyses improve the transparency and traceability of the reported results but do not alter the underlying experimental design or its limitations.</w:t>
       </w:r>
     </w:p>
     <w:p>
@@ -59,7 +59,7 @@
     </w:p>
     <w:p>
       <w:r>
-        <w:t>We agree. The revised manuscript no longer treats the main trial as actual 50 degC wine exposure. In response to this comment, we re-examined the original main-trial pressure and temperature records and quantified the realised in-bag temperatures directly. During the late storage window (days 19.5-20), the nominal 50 degC chamber averaged 34.18 +/- 0.36 degC in top-position sensors and 26.08 +/- 0.23 degC in bottom-position sensors. The nominal 19 degC chamber averaged 23.50 +/- 0.21 degC in top-position sensors and 22.84 +/- 0.30 degC in bottom-position sensors. The study is therefore interpreted as a comparison between nominal chamber conditions and measured package temperatures, not as a direct 19 degC versus 50 degC wine-temperature comparison.</w:t>
+        <w:t>We agree. The revised manuscript no longer treats the main trial as actual 50 degC wine exposure. In response to this comment, we re-examined the original main-trial pressure and temperature records and quantified the realised in-bag temperatures directly. The manuscript now defines the set-point labels C19 and C50. During the late storage window (days 19.5-20), C50 averaged 34.18 +/- 0.36 degC in top-position sensors and 26.08 +/- 0.23 degC in bottom-position sensors. C19 averaged 23.50 +/- 0.21 degC in top-position sensors and 22.84 +/- 0.30 degC in bottom-position sensors. The study is therefore interpreted as a comparison between set-point groups and measured package temperatures, not as a direct 19 degC versus 50 degC wine-temperature comparison.</w:t>
       </w:r>
     </w:p>
     <w:p>
@@ -72,7 +72,7 @@
     </w:p>
     <w:p>
       <w:r>
-        <w:t>The Title, Abstract, Sections 2, 3.1, 3.2, 3.4, Conclusions, captions and Table 2 now distinguish nominal chamber set point from measured in-bag temperature. The highlighted manuscript marks these changes.</w:t>
+        <w:t>The Title, Abstract, Sections 2, 3.1, 3.2, 3.4, Conclusions, captions and Table 2 now distinguish chamber set-point labels from measured in-bag temperature. The highlighted manuscript marks the substantive reviewer-driven changes.</w:t>
       </w:r>
     </w:p>
     <w:p>
@@ -106,7 +106,7 @@
     </w:p>
     <w:p>
       <w:r>
-        <w:t>The Abstract has been revised to reflect the re-analysis of the original experimental records. It now reports the late-temperature summaries, the uncorrected exploratory pressure result, the common-mode pressure sensitivity, the approved Table 2 chemistry presentation, and the limited role of the verification trial.</w:t>
+        <w:t>The Abstract has been compressed and revised to lead with the main findings. It defines C19 and C50 as chamber set-point labels, reports the realised in-bag temperatures, retains the exploratory pressure interpretation and summarises the approved Table 2 chemistry presentation.</w:t>
       </w:r>
     </w:p>
     <w:p>
@@ -119,7 +119,7 @@
     </w:p>
     <w:p>
       <w:r>
-        <w:t>The Abstract was replaced with a shorter evidence-aligned version. It no longer states or implies that the main trial exposed wine to 50 degC and no longer describes all pressure peaks as occurring on a single day.</w:t>
+        <w:t>The Abstract was replaced with a shorter finding-first version. It no longer states or implies that the main trial exposed wine to 50 degC and no longer describes all pressure peaks as occurring on a single day.</w:t>
       </w:r>
     </w:p>
     <w:p>
@@ -341,7 +341,7 @@
     </w:p>
     <w:p>
       <w:r>
-        <w:t>We agree. We re-examined the available original experimental records and confirmed that raw replicate-level chemical measurements were not retained in the available study records. The originally submitted Table 2 reports `0.29 +/- 0.02 g/L`, whereas no primary experimental record supports the alternative `0.29 +/- 0.20 g/L`. The manuscript therefore reports `0.29 +/- 0.02 g/L` as the traceable descriptive Table 2 value, without a significance claim. Lactic acid remains reported descriptively without significance letters. Malic acid did not decrease significantly, but we no longer state that malolactic fermentation was ruled out. Residual microbial activity cannot be excluded.</w:t>
+        <w:t>We agree. We re-examined the available original experimental records and found that raw replicate-level chemical measurements were not retained in the available study records. The originally submitted Table 2 reports `0.29 +/- 0.02 g/L`, whereas no primary experimental record supports the alternative `0.29 +/- 0.20 g/L`. The manuscript therefore reports `0.29 +/- 0.02 g/L` as the traceable descriptive Table 2 value, without a significance claim. Lactic acid remains reported descriptively without significance letters. Malic acid did not decrease significantly, but we no longer state that malolactic fermentation was ruled out. Residual microbial activity cannot be excluded.</w:t>
       </w:r>
     </w:p>
     <w:p>
@@ -388,7 +388,7 @@
     </w:p>
     <w:p>
       <w:r>
-        <w:t>Corrected. Table 2 now labels the rows as wine from the nominal 19 degC chamber and wine from the nominal 50 degC chamber. The caption states that these labels are chamber set points, not actual in-bag wine temperatures. The approved Table 2 chemistry markers are retained, while lactic acid remains descriptive without significance letters.</w:t>
+        <w:t>Corrected. Table 2 now uses C19 and C50 set-point labels. The caption states that these labels are chamber set points, not actual in-bag wine temperatures. The approved Table 2 chemistry markers are retained, while lactic acid remains descriptive without significance letters.</w:t>
       </w:r>
     </w:p>
     <w:p>
@@ -537,7 +537,7 @@
     </w:p>
     <w:p>
       <w:r>
-        <w:t>We appreciate this point. The final manuscript clarifies that the pressure analysis evaluates top versus bottom package position under the tested stack configuration. Stack height was not analysed as an independent factor because the design contained one four-box stack and two three-box stacks per nominal chamber condition. Re-examination of the original main-trial records confirmed the available sensor traces and position/chamber mapping; however, stack identifiers or sensor-to-stack pairings were not retained. Chamber condition also remains unreplicated at the chamber level, and no barometric reference was logged. The pressure ANOVA is therefore presented as exploratory sensor-level analysis rather than a definitive test of stack height, chamber temperature, package mechanics or paired stack effects.</w:t>
+        <w:t>We appreciate this point. The final manuscript clarifies that the pressure analysis evaluates top versus bottom package position under the tested stack configuration. Stack height was not analysed as an independent factor because the design contained one four-box stack and two three-box stacks per nominal chamber condition. Re-examination of the original main-trial records verified the available sensor traces and position/chamber mapping; however, stack identifiers or sensor-to-stack pairings were not retained. Chamber condition also remains unreplicated at the chamber level, and no barometric reference was logged. The pressure ANOVA is therefore presented as exploratory sensor-level analysis rather than a definitive test of stack height, chamber temperature, package mechanics or paired stack effects.</w:t>
       </w:r>
     </w:p>
     <w:p>

</xml_diff>